<commit_message>
feat(dotbiz/settlement): 대표이사 검수 결재 8건 영구 기록 (2026-05-07)
🎯 결재 결과:
1. PG 수수료 — DOTBIZ 부담 + 마진 반영 (가격 흡수)
2. 분쟁 처리 — 자동 인정 없음 (모든 분쟁 수동 검토)
3. No Deposit — 대표이사 승인 (자동 부여 X)
4. 신규 통화 — 소스마켓 추가 시 동시 결재
5. Net-30 상한 — 45일 (60일 절대 초과 금지)
6. 환차손 회계 — 분기 정산 (CFO)
7. AR 90+일 Write-off — 대표이사 결재
8. 디포짓 종류 — 6종 유지

📄 문서:
- docs/Settlement_CEO_Inspection_2026-05-07.md (결재 반영)
- docs/Settlement_CEO_Inspection_2026-05-07.docx (재생성, 17KB)

📌 코드:
- POLICY_CHANGELOG에 8건 영구 기록 (changedBy: CEO)

테스트 215/215 통과.

Co-Authored-By: Claude Opus 4.7 (1M context) <noreply@anthropic.com>
</commit_message>
<xml_diff>
--- a/docs/Settlement_CEO_Inspection_2026-05-07.docx
+++ b/docs/Settlement_CEO_Inspection_2026-05-07.docx
@@ -330,7 +330,7 @@
                 <w:sz w:val="20"/>
                 <w:szCs w:val="20"/>
               </w:rPr>
-              <w:t xml:space="preserve">✅ 구조 OK / 룰 적정성 ⓒ</w:t>
+              <w:t xml:space="preserve">✅</w:t>
             </w:r>
           </w:p>
         </w:tc>
@@ -413,7 +413,7 @@
                 <w:sz w:val="20"/>
                 <w:szCs w:val="20"/>
               </w:rPr>
-              <w:t xml:space="preserve">✅ 단순 / 의도 부합</w:t>
+              <w:t xml:space="preserve">✅</w:t>
             </w:r>
           </w:p>
         </w:tc>
@@ -496,7 +496,7 @@
                 <w:sz w:val="20"/>
                 <w:szCs w:val="20"/>
               </w:rPr>
-              <w:t xml:space="preserve">✅ 분쟁 차단용 / 표준</w:t>
+              <w:t xml:space="preserve">✅</w:t>
             </w:r>
           </w:p>
         </w:tc>
@@ -579,7 +579,7 @@
                 <w:sz w:val="20"/>
                 <w:szCs w:val="20"/>
               </w:rPr>
-              <w:t xml:space="preserve">✅ 업계 표준</w:t>
+              <w:t xml:space="preserve">✅</w:t>
             </w:r>
           </w:p>
         </w:tc>
@@ -662,7 +662,7 @@
                 <w:sz w:val="20"/>
                 <w:szCs w:val="20"/>
               </w:rPr>
-              <w:t xml:space="preserve">⚠️ 다통화 운영 비용</w:t>
+              <w:t xml:space="preserve">✅ 신규 통화 = 소스마켓 추가 시</w:t>
             </w:r>
           </w:p>
         </w:tc>
@@ -828,7 +828,7 @@
                 <w:sz w:val="20"/>
                 <w:szCs w:val="20"/>
               </w:rPr>
-              <w:t xml:space="preserve">✅ 결정됨</w:t>
+              <w:t xml:space="preserve">✅</w:t>
             </w:r>
           </w:p>
         </w:tc>
@@ -911,7 +911,7 @@
                 <w:sz w:val="20"/>
                 <w:szCs w:val="20"/>
               </w:rPr>
-              <w:t xml:space="preserve">✅ 책임 분리 명확</w:t>
+              <w:t xml:space="preserve">✅</w:t>
             </w:r>
           </w:p>
         </w:tc>
@@ -999,6 +999,354 @@
           </w:p>
         </w:tc>
       </w:tr>
+      <w:tr>
+        <w:tc>
+          <w:tcPr>
+            <w:tcW w:type="dxa" w:w="3120"/>
+            <w:tcBorders>
+              <w:top w:val="single" w:color="BFBFBF" w:sz="4"/>
+              <w:left w:val="single" w:color="BFBFBF" w:sz="4"/>
+              <w:bottom w:val="single" w:color="BFBFBF" w:sz="4"/>
+              <w:right w:val="single" w:color="BFBFBF" w:sz="4"/>
+            </w:tcBorders>
+            <w:tcMar>
+              <w:top w:type="dxa" w:w="80"/>
+              <w:left w:type="dxa" w:w="120"/>
+              <w:bottom w:type="dxa" w:w="80"/>
+              <w:right w:type="dxa" w:w="120"/>
+            </w:tcMar>
+          </w:tcPr>
+          <w:p>
+            <w:r>
+              <w:rPr>
+                <w:rFonts w:ascii="Malgun Gothic" w:cs="Malgun Gothic" w:eastAsia="Malgun Gothic" w:hAnsi="Malgun Gothic"/>
+                <w:b/>
+                <w:bCs/>
+                <w:sz w:val="20"/>
+                <w:szCs w:val="20"/>
+              </w:rPr>
+              <w:t xml:space="preserve">PG 수수료</w:t>
+            </w:r>
+          </w:p>
+        </w:tc>
+        <w:tc>
+          <w:tcPr>
+            <w:tcW w:type="dxa" w:w="3120"/>
+            <w:tcBorders>
+              <w:top w:val="single" w:color="BFBFBF" w:sz="4"/>
+              <w:left w:val="single" w:color="BFBFBF" w:sz="4"/>
+              <w:bottom w:val="single" w:color="BFBFBF" w:sz="4"/>
+              <w:right w:val="single" w:color="BFBFBF" w:sz="4"/>
+            </w:tcBorders>
+            <w:tcMar>
+              <w:top w:type="dxa" w:w="80"/>
+              <w:left w:type="dxa" w:w="120"/>
+              <w:bottom w:type="dxa" w:w="80"/>
+              <w:right w:type="dxa" w:w="120"/>
+            </w:tcMar>
+          </w:tcPr>
+          <w:p>
+            <w:r>
+              <w:rPr>
+                <w:rFonts w:ascii="Malgun Gothic" w:cs="Malgun Gothic" w:eastAsia="Malgun Gothic" w:hAnsi="Malgun Gothic"/>
+                <w:b/>
+                <w:bCs/>
+                <w:sz w:val="20"/>
+                <w:szCs w:val="20"/>
+              </w:rPr>
+              <w:t xml:space="preserve">DOTBIZ 부담 + 마진 반영</w:t>
+            </w:r>
+          </w:p>
+        </w:tc>
+        <w:tc>
+          <w:tcPr>
+            <w:tcW w:type="dxa" w:w="3120"/>
+            <w:tcBorders>
+              <w:top w:val="single" w:color="BFBFBF" w:sz="4"/>
+              <w:left w:val="single" w:color="BFBFBF" w:sz="4"/>
+              <w:bottom w:val="single" w:color="BFBFBF" w:sz="4"/>
+              <w:right w:val="single" w:color="BFBFBF" w:sz="4"/>
+            </w:tcBorders>
+            <w:tcMar>
+              <w:top w:type="dxa" w:w="80"/>
+              <w:left w:type="dxa" w:w="120"/>
+              <w:bottom w:type="dxa" w:w="80"/>
+              <w:right w:type="dxa" w:w="120"/>
+            </w:tcMar>
+          </w:tcPr>
+          <w:p>
+            <w:r>
+              <w:rPr>
+                <w:rFonts w:ascii="Malgun Gothic" w:cs="Malgun Gothic" w:eastAsia="Malgun Gothic" w:hAnsi="Malgun Gothic"/>
+                <w:sz w:val="20"/>
+                <w:szCs w:val="20"/>
+              </w:rPr>
+              <w:t xml:space="preserve">✅ 2026-05-07</w:t>
+            </w:r>
+          </w:p>
+        </w:tc>
+      </w:tr>
+      <w:tr>
+        <w:tc>
+          <w:tcPr>
+            <w:tcW w:type="dxa" w:w="3120"/>
+            <w:tcBorders>
+              <w:top w:val="single" w:color="BFBFBF" w:sz="4"/>
+              <w:left w:val="single" w:color="BFBFBF" w:sz="4"/>
+              <w:bottom w:val="single" w:color="BFBFBF" w:sz="4"/>
+              <w:right w:val="single" w:color="BFBFBF" w:sz="4"/>
+            </w:tcBorders>
+            <w:tcMar>
+              <w:top w:type="dxa" w:w="80"/>
+              <w:left w:type="dxa" w:w="120"/>
+              <w:bottom w:type="dxa" w:w="80"/>
+              <w:right w:type="dxa" w:w="120"/>
+            </w:tcMar>
+          </w:tcPr>
+          <w:p>
+            <w:r>
+              <w:rPr>
+                <w:rFonts w:ascii="Malgun Gothic" w:cs="Malgun Gothic" w:eastAsia="Malgun Gothic" w:hAnsi="Malgun Gothic"/>
+                <w:b/>
+                <w:bCs/>
+                <w:sz w:val="20"/>
+                <w:szCs w:val="20"/>
+              </w:rPr>
+              <w:t xml:space="preserve">No Deposit</w:t>
+            </w:r>
+          </w:p>
+        </w:tc>
+        <w:tc>
+          <w:tcPr>
+            <w:tcW w:type="dxa" w:w="3120"/>
+            <w:tcBorders>
+              <w:top w:val="single" w:color="BFBFBF" w:sz="4"/>
+              <w:left w:val="single" w:color="BFBFBF" w:sz="4"/>
+              <w:bottom w:val="single" w:color="BFBFBF" w:sz="4"/>
+              <w:right w:val="single" w:color="BFBFBF" w:sz="4"/>
+            </w:tcBorders>
+            <w:tcMar>
+              <w:top w:type="dxa" w:w="80"/>
+              <w:left w:type="dxa" w:w="120"/>
+              <w:bottom w:type="dxa" w:w="80"/>
+              <w:right w:type="dxa" w:w="120"/>
+            </w:tcMar>
+          </w:tcPr>
+          <w:p>
+            <w:r>
+              <w:rPr>
+                <w:rFonts w:ascii="Malgun Gothic" w:cs="Malgun Gothic" w:eastAsia="Malgun Gothic" w:hAnsi="Malgun Gothic"/>
+                <w:b/>
+                <w:bCs/>
+                <w:sz w:val="20"/>
+                <w:szCs w:val="20"/>
+              </w:rPr>
+              <w:t xml:space="preserve">대표이사 승인</w:t>
+            </w:r>
+          </w:p>
+        </w:tc>
+        <w:tc>
+          <w:tcPr>
+            <w:tcW w:type="dxa" w:w="3120"/>
+            <w:tcBorders>
+              <w:top w:val="single" w:color="BFBFBF" w:sz="4"/>
+              <w:left w:val="single" w:color="BFBFBF" w:sz="4"/>
+              <w:bottom w:val="single" w:color="BFBFBF" w:sz="4"/>
+              <w:right w:val="single" w:color="BFBFBF" w:sz="4"/>
+            </w:tcBorders>
+            <w:tcMar>
+              <w:top w:type="dxa" w:w="80"/>
+              <w:left w:type="dxa" w:w="120"/>
+              <w:bottom w:type="dxa" w:w="80"/>
+              <w:right w:type="dxa" w:w="120"/>
+            </w:tcMar>
+          </w:tcPr>
+          <w:p>
+            <w:r>
+              <w:rPr>
+                <w:rFonts w:ascii="Malgun Gothic" w:cs="Malgun Gothic" w:eastAsia="Malgun Gothic" w:hAnsi="Malgun Gothic"/>
+                <w:sz w:val="20"/>
+                <w:szCs w:val="20"/>
+              </w:rPr>
+              <w:t xml:space="preserve">✅ 2026-05-07</w:t>
+            </w:r>
+          </w:p>
+        </w:tc>
+      </w:tr>
+      <w:tr>
+        <w:tc>
+          <w:tcPr>
+            <w:tcW w:type="dxa" w:w="3120"/>
+            <w:tcBorders>
+              <w:top w:val="single" w:color="BFBFBF" w:sz="4"/>
+              <w:left w:val="single" w:color="BFBFBF" w:sz="4"/>
+              <w:bottom w:val="single" w:color="BFBFBF" w:sz="4"/>
+              <w:right w:val="single" w:color="BFBFBF" w:sz="4"/>
+            </w:tcBorders>
+            <w:tcMar>
+              <w:top w:type="dxa" w:w="80"/>
+              <w:left w:type="dxa" w:w="120"/>
+              <w:bottom w:type="dxa" w:w="80"/>
+              <w:right w:type="dxa" w:w="120"/>
+            </w:tcMar>
+          </w:tcPr>
+          <w:p>
+            <w:r>
+              <w:rPr>
+                <w:rFonts w:ascii="Malgun Gothic" w:cs="Malgun Gothic" w:eastAsia="Malgun Gothic" w:hAnsi="Malgun Gothic"/>
+                <w:b/>
+                <w:bCs/>
+                <w:sz w:val="20"/>
+                <w:szCs w:val="20"/>
+              </w:rPr>
+              <w:t xml:space="preserve">분쟁 처리</w:t>
+            </w:r>
+          </w:p>
+        </w:tc>
+        <w:tc>
+          <w:tcPr>
+            <w:tcW w:type="dxa" w:w="3120"/>
+            <w:tcBorders>
+              <w:top w:val="single" w:color="BFBFBF" w:sz="4"/>
+              <w:left w:val="single" w:color="BFBFBF" w:sz="4"/>
+              <w:bottom w:val="single" w:color="BFBFBF" w:sz="4"/>
+              <w:right w:val="single" w:color="BFBFBF" w:sz="4"/>
+            </w:tcBorders>
+            <w:tcMar>
+              <w:top w:type="dxa" w:w="80"/>
+              <w:left w:type="dxa" w:w="120"/>
+              <w:bottom w:type="dxa" w:w="80"/>
+              <w:right w:type="dxa" w:w="120"/>
+            </w:tcMar>
+          </w:tcPr>
+          <w:p>
+            <w:r>
+              <w:rPr>
+                <w:rFonts w:ascii="Malgun Gothic" w:cs="Malgun Gothic" w:eastAsia="Malgun Gothic" w:hAnsi="Malgun Gothic"/>
+                <w:b/>
+                <w:bCs/>
+                <w:sz w:val="20"/>
+                <w:szCs w:val="20"/>
+              </w:rPr>
+              <w:t xml:space="preserve">자동 인정 없음 (수동 검토)</w:t>
+            </w:r>
+          </w:p>
+        </w:tc>
+        <w:tc>
+          <w:tcPr>
+            <w:tcW w:type="dxa" w:w="3120"/>
+            <w:tcBorders>
+              <w:top w:val="single" w:color="BFBFBF" w:sz="4"/>
+              <w:left w:val="single" w:color="BFBFBF" w:sz="4"/>
+              <w:bottom w:val="single" w:color="BFBFBF" w:sz="4"/>
+              <w:right w:val="single" w:color="BFBFBF" w:sz="4"/>
+            </w:tcBorders>
+            <w:tcMar>
+              <w:top w:type="dxa" w:w="80"/>
+              <w:left w:type="dxa" w:w="120"/>
+              <w:bottom w:type="dxa" w:w="80"/>
+              <w:right w:type="dxa" w:w="120"/>
+            </w:tcMar>
+          </w:tcPr>
+          <w:p>
+            <w:r>
+              <w:rPr>
+                <w:rFonts w:ascii="Malgun Gothic" w:cs="Malgun Gothic" w:eastAsia="Malgun Gothic" w:hAnsi="Malgun Gothic"/>
+                <w:sz w:val="20"/>
+                <w:szCs w:val="20"/>
+              </w:rPr>
+              <w:t xml:space="preserve">✅ 2026-05-07</w:t>
+            </w:r>
+          </w:p>
+        </w:tc>
+      </w:tr>
+      <w:tr>
+        <w:tc>
+          <w:tcPr>
+            <w:tcW w:type="dxa" w:w="3120"/>
+            <w:tcBorders>
+              <w:top w:val="single" w:color="BFBFBF" w:sz="4"/>
+              <w:left w:val="single" w:color="BFBFBF" w:sz="4"/>
+              <w:bottom w:val="single" w:color="BFBFBF" w:sz="4"/>
+              <w:right w:val="single" w:color="BFBFBF" w:sz="4"/>
+            </w:tcBorders>
+            <w:tcMar>
+              <w:top w:type="dxa" w:w="80"/>
+              <w:left w:type="dxa" w:w="120"/>
+              <w:bottom w:type="dxa" w:w="80"/>
+              <w:right w:type="dxa" w:w="120"/>
+            </w:tcMar>
+          </w:tcPr>
+          <w:p>
+            <w:r>
+              <w:rPr>
+                <w:rFonts w:ascii="Malgun Gothic" w:cs="Malgun Gothic" w:eastAsia="Malgun Gothic" w:hAnsi="Malgun Gothic"/>
+                <w:b/>
+                <w:bCs/>
+                <w:sz w:val="20"/>
+                <w:szCs w:val="20"/>
+              </w:rPr>
+              <w:t xml:space="preserve">신규 통화</w:t>
+            </w:r>
+          </w:p>
+        </w:tc>
+        <w:tc>
+          <w:tcPr>
+            <w:tcW w:type="dxa" w:w="3120"/>
+            <w:tcBorders>
+              <w:top w:val="single" w:color="BFBFBF" w:sz="4"/>
+              <w:left w:val="single" w:color="BFBFBF" w:sz="4"/>
+              <w:bottom w:val="single" w:color="BFBFBF" w:sz="4"/>
+              <w:right w:val="single" w:color="BFBFBF" w:sz="4"/>
+            </w:tcBorders>
+            <w:tcMar>
+              <w:top w:type="dxa" w:w="80"/>
+              <w:left w:type="dxa" w:w="120"/>
+              <w:bottom w:type="dxa" w:w="80"/>
+              <w:right w:type="dxa" w:w="120"/>
+            </w:tcMar>
+          </w:tcPr>
+          <w:p>
+            <w:r>
+              <w:rPr>
+                <w:rFonts w:ascii="Malgun Gothic" w:cs="Malgun Gothic" w:eastAsia="Malgun Gothic" w:hAnsi="Malgun Gothic"/>
+                <w:b/>
+                <w:bCs/>
+                <w:sz w:val="20"/>
+                <w:szCs w:val="20"/>
+              </w:rPr>
+              <w:t xml:space="preserve">소스마켓 추가 시</w:t>
+            </w:r>
+          </w:p>
+        </w:tc>
+        <w:tc>
+          <w:tcPr>
+            <w:tcW w:type="dxa" w:w="3120"/>
+            <w:tcBorders>
+              <w:top w:val="single" w:color="BFBFBF" w:sz="4"/>
+              <w:left w:val="single" w:color="BFBFBF" w:sz="4"/>
+              <w:bottom w:val="single" w:color="BFBFBF" w:sz="4"/>
+              <w:right w:val="single" w:color="BFBFBF" w:sz="4"/>
+            </w:tcBorders>
+            <w:tcMar>
+              <w:top w:type="dxa" w:w="80"/>
+              <w:left w:type="dxa" w:w="120"/>
+              <w:bottom w:type="dxa" w:w="80"/>
+              <w:right w:type="dxa" w:w="120"/>
+            </w:tcMar>
+          </w:tcPr>
+          <w:p>
+            <w:r>
+              <w:rPr>
+                <w:rFonts w:ascii="Malgun Gothic" w:cs="Malgun Gothic" w:eastAsia="Malgun Gothic" w:hAnsi="Malgun Gothic"/>
+                <w:sz w:val="20"/>
+                <w:szCs w:val="20"/>
+              </w:rPr>
+              <w:t xml:space="preserve">✅ 2026-05-07</w:t>
+            </w:r>
+          </w:p>
+        </w:tc>
+      </w:tr>
     </w:tbl>
     <w:p>
       <w:r>
@@ -1030,7 +1378,7 @@
           <w:sz w:val="20"/>
           <w:szCs w:val="20"/>
         </w:rPr>
-        <w:t xml:space="preserve">: 구조 OK · 룰은 일부 항목 (Section 4) 의사결정 필요</w:t>
+        <w:t xml:space="preserve">: 구조 + 룰 모두 결재 완료. POLICY_CHANGELOG 영구 기록 처리 완료.</w:t>
       </w:r>
     </w:p>
     <w:p>
@@ -2949,7 +3297,7 @@
           <w:sz w:val="20"/>
           <w:szCs w:val="20"/>
         </w:rPr>
-        <w:t xml:space="preserve">ⓒ PG 수수료 부담 주체 (DOTBIZ vs 고객사) — </w:t>
+        <w:t xml:space="preserve">✅ </w:t>
       </w:r>
       <w:r>
         <w:rPr>
@@ -2959,7 +3307,51 @@
           <w:sz w:val="20"/>
           <w:szCs w:val="20"/>
         </w:rPr>
-        <w:t xml:space="preserve">결재 필요</w:t>
+        <w:t xml:space="preserve">PG 수수료: DOTBIZ 부담</w:t>
+      </w:r>
+      <w:r>
+        <w:rPr>
+          <w:rFonts w:ascii="Malgun Gothic" w:cs="Malgun Gothic" w:eastAsia="Malgun Gothic" w:hAnsi="Malgun Gothic"/>
+          <w:sz w:val="20"/>
+          <w:szCs w:val="20"/>
+        </w:rPr>
+        <w:t xml:space="preserve"> (2026-05-07 결정) → </w:t>
+      </w:r>
+      <w:r>
+        <w:rPr>
+          <w:rFonts w:ascii="Malgun Gothic" w:cs="Malgun Gothic" w:eastAsia="Malgun Gothic" w:hAnsi="Malgun Gothic"/>
+          <w:b/>
+          <w:bCs/>
+          <w:sz w:val="20"/>
+          <w:szCs w:val="20"/>
+        </w:rPr>
+        <w:t xml:space="preserve">마진에 반영하여 가격 책정</w:t>
+      </w:r>
+    </w:p>
+    <w:p>
+      <w:pPr>
+        <w:spacing w:after="80"/>
+      </w:pPr>
+      <w:r>
+        <w:rPr>
+          <w:rFonts w:ascii="Malgun Gothic" w:cs="Malgun Gothic" w:eastAsia="Malgun Gothic" w:hAnsi="Malgun Gothic"/>
+          <w:sz w:val="20"/>
+          <w:szCs w:val="20"/>
+        </w:rPr>
+        <w:t xml:space="preserve">  · 카드 결제는 송금 대비 수수료 비용 발생 → 평균 마진 7% → PG 수수료 흡수 후도 수익성 유지</w:t>
+      </w:r>
+    </w:p>
+    <w:p>
+      <w:pPr>
+        <w:spacing w:after="80"/>
+      </w:pPr>
+      <w:r>
+        <w:rPr>
+          <w:rFonts w:ascii="Malgun Gothic" w:cs="Malgun Gothic" w:eastAsia="Malgun Gothic" w:hAnsi="Malgun Gothic"/>
+          <w:sz w:val="20"/>
+          <w:szCs w:val="20"/>
+        </w:rPr>
+        <w:t xml:space="preserve">  · 고객사에는 추가 청구 없음 (가격에 이미 포함)</w:t>
       </w:r>
     </w:p>
     <w:p>
@@ -4483,7 +4875,7 @@
           <w:sz w:val="20"/>
           <w:szCs w:val="20"/>
         </w:rPr>
-        <w:t xml:space="preserve">ⓒ "No Deposit" 적용 기준 (매출 임계? 신뢰 점수? 계약 기간?) — </w:t>
+        <w:t xml:space="preserve">✅ </w:t>
       </w:r>
       <w:r>
         <w:rPr>
@@ -4493,7 +4885,54 @@
           <w:sz w:val="20"/>
           <w:szCs w:val="20"/>
         </w:rPr>
-        <w:t xml:space="preserve">결재 필요</w:t>
+        <w:t xml:space="preserve">"No Deposit" 적용은 대표이사 승인</w:t>
+      </w:r>
+      <w:r>
+        <w:rPr>
+          <w:rFonts w:ascii="Malgun Gothic" w:cs="Malgun Gothic" w:eastAsia="Malgun Gothic" w:hAnsi="Malgun Gothic"/>
+          <w:sz w:val="20"/>
+          <w:szCs w:val="20"/>
+        </w:rPr>
+        <w:t xml:space="preserve"> (2026-05-07 결정)</w:t>
+      </w:r>
+    </w:p>
+    <w:p>
+      <w:pPr>
+        <w:spacing w:after="80"/>
+      </w:pPr>
+      <w:r>
+        <w:rPr>
+          <w:rFonts w:ascii="Malgun Gothic" w:cs="Malgun Gothic" w:eastAsia="Malgun Gothic" w:hAnsi="Malgun Gothic"/>
+          <w:sz w:val="20"/>
+          <w:szCs w:val="20"/>
+        </w:rPr>
+        <w:t xml:space="preserve">  · 매출/신용 점수에 의한 자동 부여 X</w:t>
+      </w:r>
+    </w:p>
+    <w:p>
+      <w:pPr>
+        <w:spacing w:after="80"/>
+      </w:pPr>
+      <w:r>
+        <w:rPr>
+          <w:rFonts w:ascii="Malgun Gothic" w:cs="Malgun Gothic" w:eastAsia="Malgun Gothic" w:hAnsi="Malgun Gothic"/>
+          <w:sz w:val="20"/>
+          <w:szCs w:val="20"/>
+        </w:rPr>
+        <w:t xml:space="preserve">  · 케이스별로 대표이사 결재 후 ELLIS Admin이 등록</w:t>
+      </w:r>
+    </w:p>
+    <w:p>
+      <w:pPr>
+        <w:spacing w:after="80"/>
+      </w:pPr>
+      <w:r>
+        <w:rPr>
+          <w:rFonts w:ascii="Malgun Gothic" w:cs="Malgun Gothic" w:eastAsia="Malgun Gothic" w:hAnsi="Malgun Gothic"/>
+          <w:sz w:val="20"/>
+          <w:szCs w:val="20"/>
+        </w:rPr>
+        <w:t xml:space="preserve">  · POLICY_CHANGELOG에 사유 + 결재일 영구 기록</w:t>
       </w:r>
     </w:p>
     <w:p>
@@ -4750,7 +5189,64 @@
           <w:sz w:val="20"/>
           <w:szCs w:val="20"/>
         </w:rPr>
-        <w:t xml:space="preserve">ⓒ 신규 통화 추가 시 결재선 (CFO 단독? 대표이사?)</w:t>
+        <w:t xml:space="preserve">✅ </w:t>
+      </w:r>
+      <w:r>
+        <w:rPr>
+          <w:rFonts w:ascii="Malgun Gothic" w:cs="Malgun Gothic" w:eastAsia="Malgun Gothic" w:hAnsi="Malgun Gothic"/>
+          <w:b/>
+          <w:bCs/>
+          <w:sz w:val="20"/>
+          <w:szCs w:val="20"/>
+        </w:rPr>
+        <w:t xml:space="preserve">신규 통화 추가는 소스마켓 추가 시</w:t>
+      </w:r>
+      <w:r>
+        <w:rPr>
+          <w:rFonts w:ascii="Malgun Gothic" w:cs="Malgun Gothic" w:eastAsia="Malgun Gothic" w:hAnsi="Malgun Gothic"/>
+          <w:sz w:val="20"/>
+          <w:szCs w:val="20"/>
+        </w:rPr>
+        <w:t xml:space="preserve"> (2026-05-07 결정)</w:t>
+      </w:r>
+    </w:p>
+    <w:p>
+      <w:pPr>
+        <w:spacing w:after="80"/>
+      </w:pPr>
+      <w:r>
+        <w:rPr>
+          <w:rFonts w:ascii="Malgun Gothic" w:cs="Malgun Gothic" w:eastAsia="Malgun Gothic" w:hAnsi="Malgun Gothic"/>
+          <w:sz w:val="20"/>
+          <w:szCs w:val="20"/>
+        </w:rPr>
+        <w:t xml:space="preserve">  · 신규 시장(국가) 진출 결재와 통화 추가 결재를 통합</w:t>
+      </w:r>
+    </w:p>
+    <w:p>
+      <w:pPr>
+        <w:spacing w:after="80"/>
+      </w:pPr>
+      <w:r>
+        <w:rPr>
+          <w:rFonts w:ascii="Malgun Gothic" w:cs="Malgun Gothic" w:eastAsia="Malgun Gothic" w:hAnsi="Malgun Gothic"/>
+          <w:sz w:val="20"/>
+          <w:szCs w:val="20"/>
+        </w:rPr>
+        <w:t xml:space="preserve">  · 별도 통화 추가만 하지 않음 (시장 없이 통화 X)</w:t>
+      </w:r>
+    </w:p>
+    <w:p>
+      <w:pPr>
+        <w:spacing w:after="80"/>
+      </w:pPr>
+      <w:r>
+        <w:rPr>
+          <w:rFonts w:ascii="Malgun Gothic" w:cs="Malgun Gothic" w:eastAsia="Malgun Gothic" w:hAnsi="Malgun Gothic"/>
+          <w:sz w:val="20"/>
+          <w:szCs w:val="20"/>
+        </w:rPr>
+        <w:t xml:space="preserve">  · 통화 추가 = 시장 추가 = 대표이사 결재 사항</w:t>
       </w:r>
     </w:p>
     <w:p>
@@ -5781,7 +6277,7 @@
           <w:sz w:val="20"/>
           <w:szCs w:val="20"/>
         </w:rPr>
-        <w:t xml:space="preserve">ⓒ 분쟁 한도 (금액 X% 이내 자동 인정?) — </w:t>
+        <w:t xml:space="preserve">❌ </w:t>
       </w:r>
       <w:r>
         <w:rPr>
@@ -5791,7 +6287,54 @@
           <w:sz w:val="20"/>
           <w:szCs w:val="20"/>
         </w:rPr>
-        <w:t xml:space="preserve">결재 필요</w:t>
+        <w:t xml:space="preserve">분쟁 자동 인정 없음</w:t>
+      </w:r>
+      <w:r>
+        <w:rPr>
+          <w:rFonts w:ascii="Malgun Gothic" w:cs="Malgun Gothic" w:eastAsia="Malgun Gothic" w:hAnsi="Malgun Gothic"/>
+          <w:sz w:val="20"/>
+          <w:szCs w:val="20"/>
+        </w:rPr>
+        <w:t xml:space="preserve"> (2026-05-07 결정) — 모든 분쟁은 수동 검토</w:t>
+      </w:r>
+    </w:p>
+    <w:p>
+      <w:pPr>
+        <w:spacing w:after="80"/>
+      </w:pPr>
+      <w:r>
+        <w:rPr>
+          <w:rFonts w:ascii="Malgun Gothic" w:cs="Malgun Gothic" w:eastAsia="Malgun Gothic" w:hAnsi="Malgun Gothic"/>
+          <w:sz w:val="20"/>
+          <w:szCs w:val="20"/>
+        </w:rPr>
+        <w:t xml:space="preserve">  · 금액 임계값 기반 자동 처리 X</w:t>
+      </w:r>
+    </w:p>
+    <w:p>
+      <w:pPr>
+        <w:spacing w:after="80"/>
+      </w:pPr>
+      <w:r>
+        <w:rPr>
+          <w:rFonts w:ascii="Malgun Gothic" w:cs="Malgun Gothic" w:eastAsia="Malgun Gothic" w:hAnsi="Malgun Gothic"/>
+          <w:sz w:val="20"/>
+          <w:szCs w:val="20"/>
+        </w:rPr>
+        <w:t xml:space="preserve">  · Master / Accounting / EllisOP가 사안별 검토 후 인정/거절 결정</w:t>
+      </w:r>
+    </w:p>
+    <w:p>
+      <w:pPr>
+        <w:spacing w:after="80"/>
+      </w:pPr>
+      <w:r>
+        <w:rPr>
+          <w:rFonts w:ascii="Malgun Gothic" w:cs="Malgun Gothic" w:eastAsia="Malgun Gothic" w:hAnsi="Malgun Gothic"/>
+          <w:sz w:val="20"/>
+          <w:szCs w:val="20"/>
+        </w:rPr>
+        <w:t xml:space="preserve">  · 자동화 시 부정 사용 / 정책 우회 리스크 차단</w:t>
       </w:r>
     </w:p>
     <w:p>
@@ -5828,7 +6371,7 @@
           <w:sz w:val="30"/>
           <w:szCs w:val="30"/>
         </w:rPr>
-        <w:t xml:space="preserve">4️⃣ 검수자 의사결정 필요 항목 (요약)</w:t>
+        <w:t xml:space="preserve">4️⃣ 의사결정 결과 (2026-05-07 대표이사 결재)</w:t>
       </w:r>
     </w:p>
     <w:p>
@@ -6041,7 +6584,17 @@
                 <w:sz w:val="20"/>
                 <w:szCs w:val="20"/>
               </w:rPr>
-              <w:t xml:space="preserve">(a) 6종 유지 / (b) 단순화</w:t>
+              <w:t xml:space="preserve">✅ </w:t>
+            </w:r>
+            <w:r>
+              <w:rPr>
+                <w:rFonts w:ascii="Malgun Gothic" w:cs="Malgun Gothic" w:eastAsia="Malgun Gothic" w:hAnsi="Malgun Gothic"/>
+                <w:b/>
+                <w:bCs/>
+                <w:sz w:val="20"/>
+                <w:szCs w:val="20"/>
+              </w:rPr>
+              <w:t xml:space="preserve">6종 유지</w:t>
             </w:r>
           </w:p>
         </w:tc>
@@ -6068,7 +6621,7 @@
                 <w:sz w:val="20"/>
                 <w:szCs w:val="20"/>
               </w:rPr>
-              <w:t xml:space="preserve">(a) — 다양성 필요</w:t>
+              <w:t xml:space="preserve">다양성 필요</w:t>
             </w:r>
           </w:p>
         </w:tc>
@@ -6151,27 +6704,8 @@
                 <w:sz w:val="20"/>
                 <w:szCs w:val="20"/>
               </w:rPr>
-              <w:t xml:space="preserve">30 / 45 / 60일</w:t>
-            </w:r>
-          </w:p>
-        </w:tc>
-        <w:tc>
-          <w:tcPr>
-            <w:tcW w:type="dxa" w:w="2340"/>
-            <w:tcBorders>
-              <w:top w:val="single" w:color="BFBFBF" w:sz="4"/>
-              <w:left w:val="single" w:color="BFBFBF" w:sz="4"/>
-              <w:bottom w:val="single" w:color="BFBFBF" w:sz="4"/>
-              <w:right w:val="single" w:color="BFBFBF" w:sz="4"/>
-            </w:tcBorders>
-            <w:tcMar>
-              <w:top w:type="dxa" w:w="80"/>
-              <w:left w:type="dxa" w:w="120"/>
-              <w:bottom w:type="dxa" w:w="80"/>
-              <w:right w:type="dxa" w:w="120"/>
-            </w:tcMar>
-          </w:tcPr>
-          <w:p>
+              <w:t xml:space="preserve">ⓒ </w:t>
+            </w:r>
             <w:r>
               <w:rPr>
                 <w:rFonts w:ascii="Malgun Gothic" w:cs="Malgun Gothic" w:eastAsia="Malgun Gothic" w:hAnsi="Malgun Gothic"/>
@@ -6182,13 +6716,32 @@
               </w:rPr>
               <w:t xml:space="preserve">45일까지</w:t>
             </w:r>
-            <w:r>
-              <w:rPr>
-                <w:rFonts w:ascii="Malgun Gothic" w:cs="Malgun Gothic" w:eastAsia="Malgun Gothic" w:hAnsi="Malgun Gothic"/>
-                <w:sz w:val="20"/>
-                <w:szCs w:val="20"/>
-              </w:rPr>
-              <w:t xml:space="preserve"> 권장</w:t>
+          </w:p>
+        </w:tc>
+        <w:tc>
+          <w:tcPr>
+            <w:tcW w:type="dxa" w:w="2340"/>
+            <w:tcBorders>
+              <w:top w:val="single" w:color="BFBFBF" w:sz="4"/>
+              <w:left w:val="single" w:color="BFBFBF" w:sz="4"/>
+              <w:bottom w:val="single" w:color="BFBFBF" w:sz="4"/>
+              <w:right w:val="single" w:color="BFBFBF" w:sz="4"/>
+            </w:tcBorders>
+            <w:tcMar>
+              <w:top w:type="dxa" w:w="80"/>
+              <w:left w:type="dxa" w:w="120"/>
+              <w:bottom w:type="dxa" w:w="80"/>
+              <w:right w:type="dxa" w:w="120"/>
+            </w:tcMar>
+          </w:tcPr>
+          <w:p>
+            <w:r>
+              <w:rPr>
+                <w:rFonts w:ascii="Malgun Gothic" w:cs="Malgun Gothic" w:eastAsia="Malgun Gothic" w:hAnsi="Malgun Gothic"/>
+                <w:sz w:val="20"/>
+                <w:szCs w:val="20"/>
+              </w:rPr>
+              <w:t xml:space="preserve">60일 절대 초과 금지</w:t>
             </w:r>
           </w:p>
         </w:tc>
@@ -6241,74 +6794,78 @@
             <w:r>
               <w:rPr>
                 <w:rFonts w:ascii="Malgun Gothic" w:cs="Malgun Gothic" w:eastAsia="Malgun Gothic" w:hAnsi="Malgun Gothic"/>
-                <w:sz w:val="20"/>
-                <w:szCs w:val="20"/>
-              </w:rPr>
-              <w:t xml:space="preserve">PG 수수료 부담</w:t>
-            </w:r>
-          </w:p>
-        </w:tc>
-        <w:tc>
-          <w:tcPr>
-            <w:tcW w:type="dxa" w:w="2340"/>
-            <w:tcBorders>
-              <w:top w:val="single" w:color="BFBFBF" w:sz="4"/>
-              <w:left w:val="single" w:color="BFBFBF" w:sz="4"/>
-              <w:bottom w:val="single" w:color="BFBFBF" w:sz="4"/>
-              <w:right w:val="single" w:color="BFBFBF" w:sz="4"/>
-            </w:tcBorders>
-            <w:tcMar>
-              <w:top w:type="dxa" w:w="80"/>
-              <w:left w:type="dxa" w:w="120"/>
-              <w:bottom w:type="dxa" w:w="80"/>
-              <w:right w:type="dxa" w:w="120"/>
-            </w:tcMar>
-          </w:tcPr>
-          <w:p>
-            <w:r>
-              <w:rPr>
-                <w:rFonts w:ascii="Malgun Gothic" w:cs="Malgun Gothic" w:eastAsia="Malgun Gothic" w:hAnsi="Malgun Gothic"/>
-                <w:sz w:val="20"/>
-                <w:szCs w:val="20"/>
-              </w:rPr>
-              <w:t xml:space="preserve">DOTBIZ / 고객사 / 50:50</w:t>
-            </w:r>
-          </w:p>
-        </w:tc>
-        <w:tc>
-          <w:tcPr>
-            <w:tcW w:type="dxa" w:w="2340"/>
-            <w:tcBorders>
-              <w:top w:val="single" w:color="BFBFBF" w:sz="4"/>
-              <w:left w:val="single" w:color="BFBFBF" w:sz="4"/>
-              <w:bottom w:val="single" w:color="BFBFBF" w:sz="4"/>
-              <w:right w:val="single" w:color="BFBFBF" w:sz="4"/>
-            </w:tcBorders>
-            <w:tcMar>
-              <w:top w:type="dxa" w:w="80"/>
-              <w:left w:type="dxa" w:w="120"/>
-              <w:bottom w:type="dxa" w:w="80"/>
-              <w:right w:type="dxa" w:w="120"/>
-            </w:tcMar>
-          </w:tcPr>
-          <w:p>
-            <w:r>
-              <w:rPr>
-                <w:rFonts w:ascii="Malgun Gothic" w:cs="Malgun Gothic" w:eastAsia="Malgun Gothic" w:hAnsi="Malgun Gothic"/>
                 <w:b/>
                 <w:bCs/>
                 <w:sz w:val="20"/>
                 <w:szCs w:val="20"/>
               </w:rPr>
-              <w:t xml:space="preserve">고객사 부담</w:t>
-            </w:r>
-            <w:r>
-              <w:rPr>
-                <w:rFonts w:ascii="Malgun Gothic" w:cs="Malgun Gothic" w:eastAsia="Malgun Gothic" w:hAnsi="Malgun Gothic"/>
-                <w:sz w:val="20"/>
-                <w:szCs w:val="20"/>
-              </w:rPr>
-              <w:t xml:space="preserve"> 권장</w:t>
+              <w:t xml:space="preserve">PG 수수료 부담</w:t>
+            </w:r>
+          </w:p>
+        </w:tc>
+        <w:tc>
+          <w:tcPr>
+            <w:tcW w:type="dxa" w:w="2340"/>
+            <w:tcBorders>
+              <w:top w:val="single" w:color="BFBFBF" w:sz="4"/>
+              <w:left w:val="single" w:color="BFBFBF" w:sz="4"/>
+              <w:bottom w:val="single" w:color="BFBFBF" w:sz="4"/>
+              <w:right w:val="single" w:color="BFBFBF" w:sz="4"/>
+            </w:tcBorders>
+            <w:tcMar>
+              <w:top w:type="dxa" w:w="80"/>
+              <w:left w:type="dxa" w:w="120"/>
+              <w:bottom w:type="dxa" w:w="80"/>
+              <w:right w:type="dxa" w:w="120"/>
+            </w:tcMar>
+          </w:tcPr>
+          <w:p>
+            <w:r>
+              <w:rPr>
+                <w:rFonts w:ascii="Malgun Gothic" w:cs="Malgun Gothic" w:eastAsia="Malgun Gothic" w:hAnsi="Malgun Gothic"/>
+                <w:sz w:val="20"/>
+                <w:szCs w:val="20"/>
+              </w:rPr>
+              <w:t xml:space="preserve">✅ </w:t>
+            </w:r>
+            <w:r>
+              <w:rPr>
+                <w:rFonts w:ascii="Malgun Gothic" w:cs="Malgun Gothic" w:eastAsia="Malgun Gothic" w:hAnsi="Malgun Gothic"/>
+                <w:b/>
+                <w:bCs/>
+                <w:sz w:val="20"/>
+                <w:szCs w:val="20"/>
+              </w:rPr>
+              <w:t xml:space="preserve">DOTBIZ 부담</w:t>
+            </w:r>
+          </w:p>
+        </w:tc>
+        <w:tc>
+          <w:tcPr>
+            <w:tcW w:type="dxa" w:w="2340"/>
+            <w:tcBorders>
+              <w:top w:val="single" w:color="BFBFBF" w:sz="4"/>
+              <w:left w:val="single" w:color="BFBFBF" w:sz="4"/>
+              <w:bottom w:val="single" w:color="BFBFBF" w:sz="4"/>
+              <w:right w:val="single" w:color="BFBFBF" w:sz="4"/>
+            </w:tcBorders>
+            <w:tcMar>
+              <w:top w:type="dxa" w:w="80"/>
+              <w:left w:type="dxa" w:w="120"/>
+              <w:bottom w:type="dxa" w:w="80"/>
+              <w:right w:type="dxa" w:w="120"/>
+            </w:tcMar>
+          </w:tcPr>
+          <w:p>
+            <w:r>
+              <w:rPr>
+                <w:rFonts w:ascii="Malgun Gothic" w:cs="Malgun Gothic" w:eastAsia="Malgun Gothic" w:hAnsi="Malgun Gothic"/>
+                <w:b/>
+                <w:bCs/>
+                <w:sz w:val="20"/>
+                <w:szCs w:val="20"/>
+              </w:rPr>
+              <w:t xml:space="preserve">단, 마진에 반영해 가격 책정</w:t>
             </w:r>
           </w:p>
         </w:tc>
@@ -6391,27 +6948,8 @@
                 <w:sz w:val="20"/>
                 <w:szCs w:val="20"/>
               </w:rPr>
-              <w:t xml:space="preserve">매월 정산 / 분기 / 연간</w:t>
-            </w:r>
-          </w:p>
-        </w:tc>
-        <w:tc>
-          <w:tcPr>
-            <w:tcW w:type="dxa" w:w="2340"/>
-            <w:tcBorders>
-              <w:top w:val="single" w:color="BFBFBF" w:sz="4"/>
-              <w:left w:val="single" w:color="BFBFBF" w:sz="4"/>
-              <w:bottom w:val="single" w:color="BFBFBF" w:sz="4"/>
-              <w:right w:val="single" w:color="BFBFBF" w:sz="4"/>
-            </w:tcBorders>
-            <w:tcMar>
-              <w:top w:type="dxa" w:w="80"/>
-              <w:left w:type="dxa" w:w="120"/>
-              <w:bottom w:type="dxa" w:w="80"/>
-              <w:right w:type="dxa" w:w="120"/>
-            </w:tcMar>
-          </w:tcPr>
-          <w:p>
+              <w:t xml:space="preserve">ⓒ </w:t>
+            </w:r>
             <w:r>
               <w:rPr>
                 <w:rFonts w:ascii="Malgun Gothic" w:cs="Malgun Gothic" w:eastAsia="Malgun Gothic" w:hAnsi="Malgun Gothic"/>
@@ -6420,15 +6958,34 @@
                 <w:sz w:val="20"/>
                 <w:szCs w:val="20"/>
               </w:rPr>
-              <w:t xml:space="preserve">분기</w:t>
-            </w:r>
-            <w:r>
-              <w:rPr>
-                <w:rFonts w:ascii="Malgun Gothic" w:cs="Malgun Gothic" w:eastAsia="Malgun Gothic" w:hAnsi="Malgun Gothic"/>
-                <w:sz w:val="20"/>
-                <w:szCs w:val="20"/>
-              </w:rPr>
-              <w:t xml:space="preserve"> 권장</w:t>
+              <w:t xml:space="preserve">분기 정산</w:t>
+            </w:r>
+          </w:p>
+        </w:tc>
+        <w:tc>
+          <w:tcPr>
+            <w:tcW w:type="dxa" w:w="2340"/>
+            <w:tcBorders>
+              <w:top w:val="single" w:color="BFBFBF" w:sz="4"/>
+              <w:left w:val="single" w:color="BFBFBF" w:sz="4"/>
+              <w:bottom w:val="single" w:color="BFBFBF" w:sz="4"/>
+              <w:right w:val="single" w:color="BFBFBF" w:sz="4"/>
+            </w:tcBorders>
+            <w:tcMar>
+              <w:top w:type="dxa" w:w="80"/>
+              <w:left w:type="dxa" w:w="120"/>
+              <w:bottom w:type="dxa" w:w="80"/>
+              <w:right w:type="dxa" w:w="120"/>
+            </w:tcMar>
+          </w:tcPr>
+          <w:p>
+            <w:r>
+              <w:rPr>
+                <w:rFonts w:ascii="Malgun Gothic" w:cs="Malgun Gothic" w:eastAsia="Malgun Gothic" w:hAnsi="Malgun Gothic"/>
+                <w:sz w:val="20"/>
+                <w:szCs w:val="20"/>
+              </w:rPr>
+              <w:t xml:space="preserve">CFO 운영</w:t>
             </w:r>
           </w:p>
         </w:tc>
@@ -6511,27 +7068,8 @@
                 <w:sz w:val="20"/>
                 <w:szCs w:val="20"/>
               </w:rPr>
-              <w:t xml:space="preserve">CFO / 대표이사</w:t>
-            </w:r>
-          </w:p>
-        </w:tc>
-        <w:tc>
-          <w:tcPr>
-            <w:tcW w:type="dxa" w:w="2340"/>
-            <w:tcBorders>
-              <w:top w:val="single" w:color="BFBFBF" w:sz="4"/>
-              <w:left w:val="single" w:color="BFBFBF" w:sz="4"/>
-              <w:bottom w:val="single" w:color="BFBFBF" w:sz="4"/>
-              <w:right w:val="single" w:color="BFBFBF" w:sz="4"/>
-            </w:tcBorders>
-            <w:tcMar>
-              <w:top w:type="dxa" w:w="80"/>
-              <w:left w:type="dxa" w:w="120"/>
-              <w:bottom w:type="dxa" w:w="80"/>
-              <w:right w:type="dxa" w:w="120"/>
-            </w:tcMar>
-          </w:tcPr>
-          <w:p>
+              <w:t xml:space="preserve">✅ </w:t>
+            </w:r>
             <w:r>
               <w:rPr>
                 <w:rFonts w:ascii="Malgun Gothic" w:cs="Malgun Gothic" w:eastAsia="Malgun Gothic" w:hAnsi="Malgun Gothic"/>
@@ -6540,15 +7078,34 @@
                 <w:sz w:val="20"/>
                 <w:szCs w:val="20"/>
               </w:rPr>
-              <w:t xml:space="preserve">대표이사</w:t>
-            </w:r>
-            <w:r>
-              <w:rPr>
-                <w:rFonts w:ascii="Malgun Gothic" w:cs="Malgun Gothic" w:eastAsia="Malgun Gothic" w:hAnsi="Malgun Gothic"/>
-                <w:sz w:val="20"/>
-                <w:szCs w:val="20"/>
-              </w:rPr>
-              <w:t xml:space="preserve"> 권장</w:t>
+              <w:t xml:space="preserve">대표이사 결재</w:t>
+            </w:r>
+          </w:p>
+        </w:tc>
+        <w:tc>
+          <w:tcPr>
+            <w:tcW w:type="dxa" w:w="2340"/>
+            <w:tcBorders>
+              <w:top w:val="single" w:color="BFBFBF" w:sz="4"/>
+              <w:left w:val="single" w:color="BFBFBF" w:sz="4"/>
+              <w:bottom w:val="single" w:color="BFBFBF" w:sz="4"/>
+              <w:right w:val="single" w:color="BFBFBF" w:sz="4"/>
+            </w:tcBorders>
+            <w:tcMar>
+              <w:top w:type="dxa" w:w="80"/>
+              <w:left w:type="dxa" w:w="120"/>
+              <w:bottom w:type="dxa" w:w="80"/>
+              <w:right w:type="dxa" w:w="120"/>
+            </w:tcMar>
+          </w:tcPr>
+          <w:p>
+            <w:r>
+              <w:rPr>
+                <w:rFonts w:ascii="Malgun Gothic" w:cs="Malgun Gothic" w:eastAsia="Malgun Gothic" w:hAnsi="Malgun Gothic"/>
+                <w:sz w:val="20"/>
+                <w:szCs w:val="20"/>
+              </w:rPr>
+              <w:t xml:space="preserve"/>
             </w:r>
           </w:p>
         </w:tc>
@@ -6601,74 +7158,76 @@
             <w:r>
               <w:rPr>
                 <w:rFonts w:ascii="Malgun Gothic" w:cs="Malgun Gothic" w:eastAsia="Malgun Gothic" w:hAnsi="Malgun Gothic"/>
-                <w:sz w:val="20"/>
-                <w:szCs w:val="20"/>
-              </w:rPr>
-              <w:t xml:space="preserve">"No Deposit" 적용 기준</w:t>
-            </w:r>
-          </w:p>
-        </w:tc>
-        <w:tc>
-          <w:tcPr>
-            <w:tcW w:type="dxa" w:w="2340"/>
-            <w:tcBorders>
-              <w:top w:val="single" w:color="BFBFBF" w:sz="4"/>
-              <w:left w:val="single" w:color="BFBFBF" w:sz="4"/>
-              <w:bottom w:val="single" w:color="BFBFBF" w:sz="4"/>
-              <w:right w:val="single" w:color="BFBFBF" w:sz="4"/>
-            </w:tcBorders>
-            <w:tcMar>
-              <w:top w:type="dxa" w:w="80"/>
-              <w:left w:type="dxa" w:w="120"/>
-              <w:bottom w:type="dxa" w:w="80"/>
-              <w:right w:type="dxa" w:w="120"/>
-            </w:tcMar>
-          </w:tcPr>
-          <w:p>
-            <w:r>
-              <w:rPr>
-                <w:rFonts w:ascii="Malgun Gothic" w:cs="Malgun Gothic" w:eastAsia="Malgun Gothic" w:hAnsi="Malgun Gothic"/>
-                <w:sz w:val="20"/>
-                <w:szCs w:val="20"/>
-              </w:rPr>
-              <w:t xml:space="preserve">매출 임계 / 신용 점수</w:t>
-            </w:r>
-          </w:p>
-        </w:tc>
-        <w:tc>
-          <w:tcPr>
-            <w:tcW w:type="dxa" w:w="2340"/>
-            <w:tcBorders>
-              <w:top w:val="single" w:color="BFBFBF" w:sz="4"/>
-              <w:left w:val="single" w:color="BFBFBF" w:sz="4"/>
-              <w:bottom w:val="single" w:color="BFBFBF" w:sz="4"/>
-              <w:right w:val="single" w:color="BFBFBF" w:sz="4"/>
-            </w:tcBorders>
-            <w:tcMar>
-              <w:top w:type="dxa" w:w="80"/>
-              <w:left w:type="dxa" w:w="120"/>
-              <w:bottom w:type="dxa" w:w="80"/>
-              <w:right w:type="dxa" w:w="120"/>
-            </w:tcMar>
-          </w:tcPr>
-          <w:p>
-            <w:r>
-              <w:rPr>
-                <w:rFonts w:ascii="Malgun Gothic" w:cs="Malgun Gothic" w:eastAsia="Malgun Gothic" w:hAnsi="Malgun Gothic"/>
                 <w:b/>
                 <w:bCs/>
                 <w:sz w:val="20"/>
                 <w:szCs w:val="20"/>
               </w:rPr>
-              <w:t xml:space="preserve">두 조건 AND</w:t>
-            </w:r>
-            <w:r>
-              <w:rPr>
-                <w:rFonts w:ascii="Malgun Gothic" w:cs="Malgun Gothic" w:eastAsia="Malgun Gothic" w:hAnsi="Malgun Gothic"/>
-                <w:sz w:val="20"/>
-                <w:szCs w:val="20"/>
-              </w:rPr>
-              <w:t xml:space="preserve"> 권장</w:t>
+              <w:t xml:space="preserve">"No Deposit" 적용 기준</w:t>
+            </w:r>
+          </w:p>
+        </w:tc>
+        <w:tc>
+          <w:tcPr>
+            <w:tcW w:type="dxa" w:w="2340"/>
+            <w:tcBorders>
+              <w:top w:val="single" w:color="BFBFBF" w:sz="4"/>
+              <w:left w:val="single" w:color="BFBFBF" w:sz="4"/>
+              <w:bottom w:val="single" w:color="BFBFBF" w:sz="4"/>
+              <w:right w:val="single" w:color="BFBFBF" w:sz="4"/>
+            </w:tcBorders>
+            <w:tcMar>
+              <w:top w:type="dxa" w:w="80"/>
+              <w:left w:type="dxa" w:w="120"/>
+              <w:bottom w:type="dxa" w:w="80"/>
+              <w:right w:type="dxa" w:w="120"/>
+            </w:tcMar>
+          </w:tcPr>
+          <w:p>
+            <w:r>
+              <w:rPr>
+                <w:rFonts w:ascii="Malgun Gothic" w:cs="Malgun Gothic" w:eastAsia="Malgun Gothic" w:hAnsi="Malgun Gothic"/>
+                <w:sz w:val="20"/>
+                <w:szCs w:val="20"/>
+              </w:rPr>
+              <w:t xml:space="preserve">✅ </w:t>
+            </w:r>
+            <w:r>
+              <w:rPr>
+                <w:rFonts w:ascii="Malgun Gothic" w:cs="Malgun Gothic" w:eastAsia="Malgun Gothic" w:hAnsi="Malgun Gothic"/>
+                <w:b/>
+                <w:bCs/>
+                <w:sz w:val="20"/>
+                <w:szCs w:val="20"/>
+              </w:rPr>
+              <w:t xml:space="preserve">대표이사 승인</w:t>
+            </w:r>
+          </w:p>
+        </w:tc>
+        <w:tc>
+          <w:tcPr>
+            <w:tcW w:type="dxa" w:w="2340"/>
+            <w:tcBorders>
+              <w:top w:val="single" w:color="BFBFBF" w:sz="4"/>
+              <w:left w:val="single" w:color="BFBFBF" w:sz="4"/>
+              <w:bottom w:val="single" w:color="BFBFBF" w:sz="4"/>
+              <w:right w:val="single" w:color="BFBFBF" w:sz="4"/>
+            </w:tcBorders>
+            <w:tcMar>
+              <w:top w:type="dxa" w:w="80"/>
+              <w:left w:type="dxa" w:w="120"/>
+              <w:bottom w:type="dxa" w:w="80"/>
+              <w:right w:type="dxa" w:w="120"/>
+            </w:tcMar>
+          </w:tcPr>
+          <w:p>
+            <w:r>
+              <w:rPr>
+                <w:rFonts w:ascii="Malgun Gothic" w:cs="Malgun Gothic" w:eastAsia="Malgun Gothic" w:hAnsi="Malgun Gothic"/>
+                <w:sz w:val="20"/>
+                <w:szCs w:val="20"/>
+              </w:rPr>
+              <w:t xml:space="preserve">매출/신용 자동 X · 케이스별 결재</w:t>
             </w:r>
           </w:p>
         </w:tc>
@@ -6721,74 +7280,76 @@
             <w:r>
               <w:rPr>
                 <w:rFonts w:ascii="Malgun Gothic" w:cs="Malgun Gothic" w:eastAsia="Malgun Gothic" w:hAnsi="Malgun Gothic"/>
-                <w:sz w:val="20"/>
-                <w:szCs w:val="20"/>
-              </w:rPr>
-              <w:t xml:space="preserve">신규 통화 추가 결재선</w:t>
-            </w:r>
-          </w:p>
-        </w:tc>
-        <w:tc>
-          <w:tcPr>
-            <w:tcW w:type="dxa" w:w="2340"/>
-            <w:tcBorders>
-              <w:top w:val="single" w:color="BFBFBF" w:sz="4"/>
-              <w:left w:val="single" w:color="BFBFBF" w:sz="4"/>
-              <w:bottom w:val="single" w:color="BFBFBF" w:sz="4"/>
-              <w:right w:val="single" w:color="BFBFBF" w:sz="4"/>
-            </w:tcBorders>
-            <w:tcMar>
-              <w:top w:type="dxa" w:w="80"/>
-              <w:left w:type="dxa" w:w="120"/>
-              <w:bottom w:type="dxa" w:w="80"/>
-              <w:right w:type="dxa" w:w="120"/>
-            </w:tcMar>
-          </w:tcPr>
-          <w:p>
-            <w:r>
-              <w:rPr>
-                <w:rFonts w:ascii="Malgun Gothic" w:cs="Malgun Gothic" w:eastAsia="Malgun Gothic" w:hAnsi="Malgun Gothic"/>
-                <w:sz w:val="20"/>
-                <w:szCs w:val="20"/>
-              </w:rPr>
-              <w:t xml:space="preserve">CFO 단독 / 대표이사</w:t>
-            </w:r>
-          </w:p>
-        </w:tc>
-        <w:tc>
-          <w:tcPr>
-            <w:tcW w:type="dxa" w:w="2340"/>
-            <w:tcBorders>
-              <w:top w:val="single" w:color="BFBFBF" w:sz="4"/>
-              <w:left w:val="single" w:color="BFBFBF" w:sz="4"/>
-              <w:bottom w:val="single" w:color="BFBFBF" w:sz="4"/>
-              <w:right w:val="single" w:color="BFBFBF" w:sz="4"/>
-            </w:tcBorders>
-            <w:tcMar>
-              <w:top w:type="dxa" w:w="80"/>
-              <w:left w:type="dxa" w:w="120"/>
-              <w:bottom w:type="dxa" w:w="80"/>
-              <w:right w:type="dxa" w:w="120"/>
-            </w:tcMar>
-          </w:tcPr>
-          <w:p>
-            <w:r>
-              <w:rPr>
-                <w:rFonts w:ascii="Malgun Gothic" w:cs="Malgun Gothic" w:eastAsia="Malgun Gothic" w:hAnsi="Malgun Gothic"/>
                 <w:b/>
                 <w:bCs/>
                 <w:sz w:val="20"/>
                 <w:szCs w:val="20"/>
               </w:rPr>
-              <w:t xml:space="preserve">CFO 단독</w:t>
-            </w:r>
-            <w:r>
-              <w:rPr>
-                <w:rFonts w:ascii="Malgun Gothic" w:cs="Malgun Gothic" w:eastAsia="Malgun Gothic" w:hAnsi="Malgun Gothic"/>
-                <w:sz w:val="20"/>
-                <w:szCs w:val="20"/>
-              </w:rPr>
-              <w:t xml:space="preserve"> 권장</w:t>
+              <w:t xml:space="preserve">신규 통화 추가 트리거</w:t>
+            </w:r>
+          </w:p>
+        </w:tc>
+        <w:tc>
+          <w:tcPr>
+            <w:tcW w:type="dxa" w:w="2340"/>
+            <w:tcBorders>
+              <w:top w:val="single" w:color="BFBFBF" w:sz="4"/>
+              <w:left w:val="single" w:color="BFBFBF" w:sz="4"/>
+              <w:bottom w:val="single" w:color="BFBFBF" w:sz="4"/>
+              <w:right w:val="single" w:color="BFBFBF" w:sz="4"/>
+            </w:tcBorders>
+            <w:tcMar>
+              <w:top w:type="dxa" w:w="80"/>
+              <w:left w:type="dxa" w:w="120"/>
+              <w:bottom w:type="dxa" w:w="80"/>
+              <w:right w:type="dxa" w:w="120"/>
+            </w:tcMar>
+          </w:tcPr>
+          <w:p>
+            <w:r>
+              <w:rPr>
+                <w:rFonts w:ascii="Malgun Gothic" w:cs="Malgun Gothic" w:eastAsia="Malgun Gothic" w:hAnsi="Malgun Gothic"/>
+                <w:sz w:val="20"/>
+                <w:szCs w:val="20"/>
+              </w:rPr>
+              <w:t xml:space="preserve">✅ </w:t>
+            </w:r>
+            <w:r>
+              <w:rPr>
+                <w:rFonts w:ascii="Malgun Gothic" w:cs="Malgun Gothic" w:eastAsia="Malgun Gothic" w:hAnsi="Malgun Gothic"/>
+                <w:b/>
+                <w:bCs/>
+                <w:sz w:val="20"/>
+                <w:szCs w:val="20"/>
+              </w:rPr>
+              <w:t xml:space="preserve">소스마켓 추가 시</w:t>
+            </w:r>
+          </w:p>
+        </w:tc>
+        <w:tc>
+          <w:tcPr>
+            <w:tcW w:type="dxa" w:w="2340"/>
+            <w:tcBorders>
+              <w:top w:val="single" w:color="BFBFBF" w:sz="4"/>
+              <w:left w:val="single" w:color="BFBFBF" w:sz="4"/>
+              <w:bottom w:val="single" w:color="BFBFBF" w:sz="4"/>
+              <w:right w:val="single" w:color="BFBFBF" w:sz="4"/>
+            </w:tcBorders>
+            <w:tcMar>
+              <w:top w:type="dxa" w:w="80"/>
+              <w:left w:type="dxa" w:w="120"/>
+              <w:bottom w:type="dxa" w:w="80"/>
+              <w:right w:type="dxa" w:w="120"/>
+            </w:tcMar>
+          </w:tcPr>
+          <w:p>
+            <w:r>
+              <w:rPr>
+                <w:rFonts w:ascii="Malgun Gothic" w:cs="Malgun Gothic" w:eastAsia="Malgun Gothic" w:hAnsi="Malgun Gothic"/>
+                <w:sz w:val="20"/>
+                <w:szCs w:val="20"/>
+              </w:rPr>
+              <w:t xml:space="preserve">신규 시장 진출 결재와 동시</w:t>
             </w:r>
           </w:p>
         </w:tc>
@@ -6841,74 +7402,76 @@
             <w:r>
               <w:rPr>
                 <w:rFonts w:ascii="Malgun Gothic" w:cs="Malgun Gothic" w:eastAsia="Malgun Gothic" w:hAnsi="Malgun Gothic"/>
-                <w:sz w:val="20"/>
-                <w:szCs w:val="20"/>
-              </w:rPr>
-              <w:t xml:space="preserve">분쟁 자동 인정 한도</w:t>
-            </w:r>
-          </w:p>
-        </w:tc>
-        <w:tc>
-          <w:tcPr>
-            <w:tcW w:type="dxa" w:w="2340"/>
-            <w:tcBorders>
-              <w:top w:val="single" w:color="BFBFBF" w:sz="4"/>
-              <w:left w:val="single" w:color="BFBFBF" w:sz="4"/>
-              <w:bottom w:val="single" w:color="BFBFBF" w:sz="4"/>
-              <w:right w:val="single" w:color="BFBFBF" w:sz="4"/>
-            </w:tcBorders>
-            <w:tcMar>
-              <w:top w:type="dxa" w:w="80"/>
-              <w:left w:type="dxa" w:w="120"/>
-              <w:bottom w:type="dxa" w:w="80"/>
-              <w:right w:type="dxa" w:w="120"/>
-            </w:tcMar>
-          </w:tcPr>
-          <w:p>
-            <w:r>
-              <w:rPr>
-                <w:rFonts w:ascii="Malgun Gothic" w:cs="Malgun Gothic" w:eastAsia="Malgun Gothic" w:hAnsi="Malgun Gothic"/>
-                <w:sz w:val="20"/>
-                <w:szCs w:val="20"/>
-              </w:rPr>
-              <w:t xml:space="preserve">$50 이하 / $100 / X</w:t>
-            </w:r>
-          </w:p>
-        </w:tc>
-        <w:tc>
-          <w:tcPr>
-            <w:tcW w:type="dxa" w:w="2340"/>
-            <w:tcBorders>
-              <w:top w:val="single" w:color="BFBFBF" w:sz="4"/>
-              <w:left w:val="single" w:color="BFBFBF" w:sz="4"/>
-              <w:bottom w:val="single" w:color="BFBFBF" w:sz="4"/>
-              <w:right w:val="single" w:color="BFBFBF" w:sz="4"/>
-            </w:tcBorders>
-            <w:tcMar>
-              <w:top w:type="dxa" w:w="80"/>
-              <w:left w:type="dxa" w:w="120"/>
-              <w:bottom w:type="dxa" w:w="80"/>
-              <w:right w:type="dxa" w:w="120"/>
-            </w:tcMar>
-          </w:tcPr>
-          <w:p>
-            <w:r>
-              <w:rPr>
-                <w:rFonts w:ascii="Malgun Gothic" w:cs="Malgun Gothic" w:eastAsia="Malgun Gothic" w:hAnsi="Malgun Gothic"/>
                 <w:b/>
                 <w:bCs/>
                 <w:sz w:val="20"/>
                 <w:szCs w:val="20"/>
               </w:rPr>
-              <w:t xml:space="preserve">$100 이하</w:t>
-            </w:r>
-            <w:r>
-              <w:rPr>
-                <w:rFonts w:ascii="Malgun Gothic" w:cs="Malgun Gothic" w:eastAsia="Malgun Gothic" w:hAnsi="Malgun Gothic"/>
-                <w:sz w:val="20"/>
-                <w:szCs w:val="20"/>
-              </w:rPr>
-              <w:t xml:space="preserve"> 권장</w:t>
+              <w:t xml:space="preserve">분쟁 자동 인정 한도</w:t>
+            </w:r>
+          </w:p>
+        </w:tc>
+        <w:tc>
+          <w:tcPr>
+            <w:tcW w:type="dxa" w:w="2340"/>
+            <w:tcBorders>
+              <w:top w:val="single" w:color="BFBFBF" w:sz="4"/>
+              <w:left w:val="single" w:color="BFBFBF" w:sz="4"/>
+              <w:bottom w:val="single" w:color="BFBFBF" w:sz="4"/>
+              <w:right w:val="single" w:color="BFBFBF" w:sz="4"/>
+            </w:tcBorders>
+            <w:tcMar>
+              <w:top w:type="dxa" w:w="80"/>
+              <w:left w:type="dxa" w:w="120"/>
+              <w:bottom w:type="dxa" w:w="80"/>
+              <w:right w:type="dxa" w:w="120"/>
+            </w:tcMar>
+          </w:tcPr>
+          <w:p>
+            <w:r>
+              <w:rPr>
+                <w:rFonts w:ascii="Malgun Gothic" w:cs="Malgun Gothic" w:eastAsia="Malgun Gothic" w:hAnsi="Malgun Gothic"/>
+                <w:sz w:val="20"/>
+                <w:szCs w:val="20"/>
+              </w:rPr>
+              <w:t xml:space="preserve">❌ </w:t>
+            </w:r>
+            <w:r>
+              <w:rPr>
+                <w:rFonts w:ascii="Malgun Gothic" w:cs="Malgun Gothic" w:eastAsia="Malgun Gothic" w:hAnsi="Malgun Gothic"/>
+                <w:b/>
+                <w:bCs/>
+                <w:sz w:val="20"/>
+                <w:szCs w:val="20"/>
+              </w:rPr>
+              <w:t xml:space="preserve">자동 인정 없음</w:t>
+            </w:r>
+          </w:p>
+        </w:tc>
+        <w:tc>
+          <w:tcPr>
+            <w:tcW w:type="dxa" w:w="2340"/>
+            <w:tcBorders>
+              <w:top w:val="single" w:color="BFBFBF" w:sz="4"/>
+              <w:left w:val="single" w:color="BFBFBF" w:sz="4"/>
+              <w:bottom w:val="single" w:color="BFBFBF" w:sz="4"/>
+              <w:right w:val="single" w:color="BFBFBF" w:sz="4"/>
+            </w:tcBorders>
+            <w:tcMar>
+              <w:top w:type="dxa" w:w="80"/>
+              <w:left w:type="dxa" w:w="120"/>
+              <w:bottom w:type="dxa" w:w="80"/>
+              <w:right w:type="dxa" w:w="120"/>
+            </w:tcMar>
+          </w:tcPr>
+          <w:p>
+            <w:r>
+              <w:rPr>
+                <w:rFonts w:ascii="Malgun Gothic" w:cs="Malgun Gothic" w:eastAsia="Malgun Gothic" w:hAnsi="Malgun Gothic"/>
+                <w:sz w:val="20"/>
+                <w:szCs w:val="20"/>
+              </w:rPr>
+              <w:t xml:space="preserve">모든 분쟁 수동 검토</w:t>
             </w:r>
           </w:p>
         </w:tc>
@@ -6953,7 +7516,7 @@
           <w:sz w:val="30"/>
           <w:szCs w:val="30"/>
         </w:rPr>
-        <w:t xml:space="preserve">5️⃣ 종합 결재 요청</w:t>
+        <w:t xml:space="preserve">5️⃣ 종합 결재 결과 (2026-05-07)</w:t>
       </w:r>
     </w:p>
     <w:p>
@@ -6974,7 +7537,7 @@
           <w:sz w:val="26"/>
           <w:szCs w:val="26"/>
         </w:rPr>
-        <w:t xml:space="preserve">✅ 구조 검수 (Architecture)</w:t>
+        <w:t xml:space="preserve">✅ 구조 검수 (Architecture) — 결재 완료</w:t>
       </w:r>
     </w:p>
     <w:p>
@@ -7028,7 +7591,7 @@
           <w:sz w:val="20"/>
           <w:szCs w:val="20"/>
         </w:rPr>
-        <w:t xml:space="preserve">특히:</w:t>
+        <w:t xml:space="preserve">핵심 원칙:</w:t>
       </w:r>
     </w:p>
     <w:p>
@@ -7056,7 +7619,7 @@
           <w:sz w:val="20"/>
           <w:szCs w:val="20"/>
         </w:rPr>
-        <w:t xml:space="preserve"> 원칙 → 감사 추적성 확보</w:t>
+        <w:t xml:space="preserve"> → 감사 추적성 확보</w:t>
       </w:r>
     </w:p>
     <w:p>
@@ -7133,7 +7696,7 @@
           <w:sz w:val="26"/>
           <w:szCs w:val="26"/>
         </w:rPr>
-        <w:t xml:space="preserve">🟡 룰 검수 (Rules)</w:t>
+        <w:t xml:space="preserve">✅ 룰 검수 (Rules) — 결재 완료</w:t>
       </w:r>
     </w:p>
     <w:p>
@@ -7151,25 +7714,547 @@
           <w:sz w:val="20"/>
           <w:szCs w:val="20"/>
         </w:rPr>
-        <w:t xml:space="preserve">대부분의 룰은 업계 표준 또는 결정 완료. </w:t>
-      </w:r>
-      <w:r>
-        <w:rPr>
-          <w:rFonts w:ascii="Malgun Gothic" w:cs="Malgun Gothic" w:eastAsia="Malgun Gothic" w:hAnsi="Malgun Gothic"/>
-          <w:b/>
-          <w:bCs/>
-          <w:sz w:val="20"/>
-          <w:szCs w:val="20"/>
-        </w:rPr>
-        <w:t xml:space="preserve">8개 항목만 결재 필요</w:t>
-      </w:r>
-      <w:r>
-        <w:rPr>
-          <w:rFonts w:ascii="Malgun Gothic" w:cs="Malgun Gothic" w:eastAsia="Malgun Gothic" w:hAnsi="Malgun Gothic"/>
-          <w:sz w:val="20"/>
-          <w:szCs w:val="20"/>
-        </w:rPr>
-        <w:t xml:space="preserve"> (Section 4 표).</w:t>
+        <w:t xml:space="preserve">8개 의사결정 항목 모두 결재 완료. 핵심:</w:t>
+      </w:r>
+    </w:p>
+    <w:p>
+      <w:r>
+        <w:t xml:space="preserve"/>
+      </w:r>
+    </w:p>
+    <w:tbl>
+      <w:tblPr>
+        <w:tblW w:type="dxa" w:w="9360"/>
+        <w:tblBorders>
+          <w:top w:val="single" w:color="auto" w:sz="4"/>
+          <w:left w:val="single" w:color="auto" w:sz="4"/>
+          <w:bottom w:val="single" w:color="auto" w:sz="4"/>
+          <w:right w:val="single" w:color="auto" w:sz="4"/>
+          <w:insideH w:val="single" w:color="auto" w:sz="4"/>
+          <w:insideV w:val="single" w:color="auto" w:sz="4"/>
+        </w:tblBorders>
+      </w:tblPr>
+      <w:tblGrid>
+        <w:gridCol w:w="4680"/>
+        <w:gridCol w:w="4680"/>
+      </w:tblGrid>
+      <w:tr>
+        <w:trPr>
+          <w:tblHeader/>
+        </w:trPr>
+        <w:tc>
+          <w:tcPr>
+            <w:tcW w:type="dxa" w:w="4680"/>
+            <w:tcBorders>
+              <w:top w:val="single" w:color="BFBFBF" w:sz="4"/>
+              <w:left w:val="single" w:color="BFBFBF" w:sz="4"/>
+              <w:bottom w:val="single" w:color="BFBFBF" w:sz="4"/>
+              <w:right w:val="single" w:color="BFBFBF" w:sz="4"/>
+            </w:tcBorders>
+            <w:shd w:fill="D5E8F0" w:val="clear"/>
+            <w:tcMar>
+              <w:top w:type="dxa" w:w="80"/>
+              <w:left w:type="dxa" w:w="120"/>
+              <w:bottom w:type="dxa" w:w="80"/>
+              <w:right w:type="dxa" w:w="120"/>
+            </w:tcMar>
+          </w:tcPr>
+          <w:p>
+            <w:r>
+              <w:rPr>
+                <w:b/>
+                <w:bCs/>
+              </w:rPr>
+            </w:r>
+          </w:p>
+        </w:tc>
+        <w:tc>
+          <w:tcPr>
+            <w:tcW w:type="dxa" w:w="4680"/>
+            <w:tcBorders>
+              <w:top w:val="single" w:color="BFBFBF" w:sz="4"/>
+              <w:left w:val="single" w:color="BFBFBF" w:sz="4"/>
+              <w:bottom w:val="single" w:color="BFBFBF" w:sz="4"/>
+              <w:right w:val="single" w:color="BFBFBF" w:sz="4"/>
+            </w:tcBorders>
+            <w:shd w:fill="D5E8F0" w:val="clear"/>
+            <w:tcMar>
+              <w:top w:type="dxa" w:w="80"/>
+              <w:left w:type="dxa" w:w="120"/>
+              <w:bottom w:type="dxa" w:w="80"/>
+              <w:right w:type="dxa" w:w="120"/>
+            </w:tcMar>
+          </w:tcPr>
+          <w:p>
+            <w:r>
+              <w:rPr>
+                <w:b/>
+                <w:bCs/>
+              </w:rPr>
+            </w:r>
+          </w:p>
+        </w:tc>
+      </w:tr>
+      <w:tr>
+        <w:tc>
+          <w:tcPr>
+            <w:tcW w:type="dxa" w:w="4680"/>
+            <w:tcBorders>
+              <w:top w:val="single" w:color="BFBFBF" w:sz="4"/>
+              <w:left w:val="single" w:color="BFBFBF" w:sz="4"/>
+              <w:bottom w:val="single" w:color="BFBFBF" w:sz="4"/>
+              <w:right w:val="single" w:color="BFBFBF" w:sz="4"/>
+            </w:tcBorders>
+            <w:tcMar>
+              <w:top w:type="dxa" w:w="80"/>
+              <w:left w:type="dxa" w:w="120"/>
+              <w:bottom w:type="dxa" w:w="80"/>
+              <w:right w:type="dxa" w:w="120"/>
+            </w:tcMar>
+          </w:tcPr>
+          <w:p>
+            <w:r>
+              <w:rPr>
+                <w:rFonts w:ascii="Malgun Gothic" w:cs="Malgun Gothic" w:eastAsia="Malgun Gothic" w:hAnsi="Malgun Gothic"/>
+                <w:b/>
+                <w:bCs/>
+                <w:sz w:val="20"/>
+                <w:szCs w:val="20"/>
+              </w:rPr>
+              <w:t xml:space="preserve">PG 수수료</w:t>
+            </w:r>
+          </w:p>
+        </w:tc>
+        <w:tc>
+          <w:tcPr>
+            <w:tcW w:type="dxa" w:w="4680"/>
+            <w:tcBorders>
+              <w:top w:val="single" w:color="BFBFBF" w:sz="4"/>
+              <w:left w:val="single" w:color="BFBFBF" w:sz="4"/>
+              <w:bottom w:val="single" w:color="BFBFBF" w:sz="4"/>
+              <w:right w:val="single" w:color="BFBFBF" w:sz="4"/>
+            </w:tcBorders>
+            <w:tcMar>
+              <w:top w:type="dxa" w:w="80"/>
+              <w:left w:type="dxa" w:w="120"/>
+              <w:bottom w:type="dxa" w:w="80"/>
+              <w:right w:type="dxa" w:w="120"/>
+            </w:tcMar>
+          </w:tcPr>
+          <w:p>
+            <w:r>
+              <w:rPr>
+                <w:rFonts w:ascii="Malgun Gothic" w:cs="Malgun Gothic" w:eastAsia="Malgun Gothic" w:hAnsi="Malgun Gothic"/>
+                <w:sz w:val="20"/>
+                <w:szCs w:val="20"/>
+              </w:rPr>
+              <w:t xml:space="preserve">DOTBIZ 부담 + 마진에 반영 (가격에 흡수)</w:t>
+            </w:r>
+          </w:p>
+        </w:tc>
+      </w:tr>
+      <w:tr>
+        <w:tc>
+          <w:tcPr>
+            <w:tcW w:type="dxa" w:w="4680"/>
+            <w:tcBorders>
+              <w:top w:val="single" w:color="BFBFBF" w:sz="4"/>
+              <w:left w:val="single" w:color="BFBFBF" w:sz="4"/>
+              <w:bottom w:val="single" w:color="BFBFBF" w:sz="4"/>
+              <w:right w:val="single" w:color="BFBFBF" w:sz="4"/>
+            </w:tcBorders>
+            <w:tcMar>
+              <w:top w:type="dxa" w:w="80"/>
+              <w:left w:type="dxa" w:w="120"/>
+              <w:bottom w:type="dxa" w:w="80"/>
+              <w:right w:type="dxa" w:w="120"/>
+            </w:tcMar>
+          </w:tcPr>
+          <w:p>
+            <w:r>
+              <w:rPr>
+                <w:rFonts w:ascii="Malgun Gothic" w:cs="Malgun Gothic" w:eastAsia="Malgun Gothic" w:hAnsi="Malgun Gothic"/>
+                <w:b/>
+                <w:bCs/>
+                <w:sz w:val="20"/>
+                <w:szCs w:val="20"/>
+              </w:rPr>
+              <w:t xml:space="preserve">분쟁 처리</w:t>
+            </w:r>
+          </w:p>
+        </w:tc>
+        <w:tc>
+          <w:tcPr>
+            <w:tcW w:type="dxa" w:w="4680"/>
+            <w:tcBorders>
+              <w:top w:val="single" w:color="BFBFBF" w:sz="4"/>
+              <w:left w:val="single" w:color="BFBFBF" w:sz="4"/>
+              <w:bottom w:val="single" w:color="BFBFBF" w:sz="4"/>
+              <w:right w:val="single" w:color="BFBFBF" w:sz="4"/>
+            </w:tcBorders>
+            <w:tcMar>
+              <w:top w:type="dxa" w:w="80"/>
+              <w:left w:type="dxa" w:w="120"/>
+              <w:bottom w:type="dxa" w:w="80"/>
+              <w:right w:type="dxa" w:w="120"/>
+            </w:tcMar>
+          </w:tcPr>
+          <w:p>
+            <w:r>
+              <w:rPr>
+                <w:rFonts w:ascii="Malgun Gothic" w:cs="Malgun Gothic" w:eastAsia="Malgun Gothic" w:hAnsi="Malgun Gothic"/>
+                <w:sz w:val="20"/>
+                <w:szCs w:val="20"/>
+              </w:rPr>
+              <w:t xml:space="preserve">자동 인정 없음 — 모든 분쟁 수동 검토</w:t>
+            </w:r>
+          </w:p>
+        </w:tc>
+      </w:tr>
+      <w:tr>
+        <w:tc>
+          <w:tcPr>
+            <w:tcW w:type="dxa" w:w="4680"/>
+            <w:tcBorders>
+              <w:top w:val="single" w:color="BFBFBF" w:sz="4"/>
+              <w:left w:val="single" w:color="BFBFBF" w:sz="4"/>
+              <w:bottom w:val="single" w:color="BFBFBF" w:sz="4"/>
+              <w:right w:val="single" w:color="BFBFBF" w:sz="4"/>
+            </w:tcBorders>
+            <w:tcMar>
+              <w:top w:type="dxa" w:w="80"/>
+              <w:left w:type="dxa" w:w="120"/>
+              <w:bottom w:type="dxa" w:w="80"/>
+              <w:right w:type="dxa" w:w="120"/>
+            </w:tcMar>
+          </w:tcPr>
+          <w:p>
+            <w:r>
+              <w:rPr>
+                <w:rFonts w:ascii="Malgun Gothic" w:cs="Malgun Gothic" w:eastAsia="Malgun Gothic" w:hAnsi="Malgun Gothic"/>
+                <w:b/>
+                <w:bCs/>
+                <w:sz w:val="20"/>
+                <w:szCs w:val="20"/>
+              </w:rPr>
+              <w:t xml:space="preserve">No Deposit</w:t>
+            </w:r>
+          </w:p>
+        </w:tc>
+        <w:tc>
+          <w:tcPr>
+            <w:tcW w:type="dxa" w:w="4680"/>
+            <w:tcBorders>
+              <w:top w:val="single" w:color="BFBFBF" w:sz="4"/>
+              <w:left w:val="single" w:color="BFBFBF" w:sz="4"/>
+              <w:bottom w:val="single" w:color="BFBFBF" w:sz="4"/>
+              <w:right w:val="single" w:color="BFBFBF" w:sz="4"/>
+            </w:tcBorders>
+            <w:tcMar>
+              <w:top w:type="dxa" w:w="80"/>
+              <w:left w:type="dxa" w:w="120"/>
+              <w:bottom w:type="dxa" w:w="80"/>
+              <w:right w:type="dxa" w:w="120"/>
+            </w:tcMar>
+          </w:tcPr>
+          <w:p>
+            <w:r>
+              <w:rPr>
+                <w:rFonts w:ascii="Malgun Gothic" w:cs="Malgun Gothic" w:eastAsia="Malgun Gothic" w:hAnsi="Malgun Gothic"/>
+                <w:sz w:val="20"/>
+                <w:szCs w:val="20"/>
+              </w:rPr>
+              <w:t xml:space="preserve">대표이사 승인 (자동 부여 X)</w:t>
+            </w:r>
+          </w:p>
+        </w:tc>
+      </w:tr>
+      <w:tr>
+        <w:tc>
+          <w:tcPr>
+            <w:tcW w:type="dxa" w:w="4680"/>
+            <w:tcBorders>
+              <w:top w:val="single" w:color="BFBFBF" w:sz="4"/>
+              <w:left w:val="single" w:color="BFBFBF" w:sz="4"/>
+              <w:bottom w:val="single" w:color="BFBFBF" w:sz="4"/>
+              <w:right w:val="single" w:color="BFBFBF" w:sz="4"/>
+            </w:tcBorders>
+            <w:tcMar>
+              <w:top w:type="dxa" w:w="80"/>
+              <w:left w:type="dxa" w:w="120"/>
+              <w:bottom w:type="dxa" w:w="80"/>
+              <w:right w:type="dxa" w:w="120"/>
+            </w:tcMar>
+          </w:tcPr>
+          <w:p>
+            <w:r>
+              <w:rPr>
+                <w:rFonts w:ascii="Malgun Gothic" w:cs="Malgun Gothic" w:eastAsia="Malgun Gothic" w:hAnsi="Malgun Gothic"/>
+                <w:b/>
+                <w:bCs/>
+                <w:sz w:val="20"/>
+                <w:szCs w:val="20"/>
+              </w:rPr>
+              <w:t xml:space="preserve">신규 통화</w:t>
+            </w:r>
+          </w:p>
+        </w:tc>
+        <w:tc>
+          <w:tcPr>
+            <w:tcW w:type="dxa" w:w="4680"/>
+            <w:tcBorders>
+              <w:top w:val="single" w:color="BFBFBF" w:sz="4"/>
+              <w:left w:val="single" w:color="BFBFBF" w:sz="4"/>
+              <w:bottom w:val="single" w:color="BFBFBF" w:sz="4"/>
+              <w:right w:val="single" w:color="BFBFBF" w:sz="4"/>
+            </w:tcBorders>
+            <w:tcMar>
+              <w:top w:type="dxa" w:w="80"/>
+              <w:left w:type="dxa" w:w="120"/>
+              <w:bottom w:type="dxa" w:w="80"/>
+              <w:right w:type="dxa" w:w="120"/>
+            </w:tcMar>
+          </w:tcPr>
+          <w:p>
+            <w:r>
+              <w:rPr>
+                <w:rFonts w:ascii="Malgun Gothic" w:cs="Malgun Gothic" w:eastAsia="Malgun Gothic" w:hAnsi="Malgun Gothic"/>
+                <w:sz w:val="20"/>
+                <w:szCs w:val="20"/>
+              </w:rPr>
+              <w:t xml:space="preserve">소스마켓 추가 시 동시 결재</w:t>
+            </w:r>
+          </w:p>
+        </w:tc>
+      </w:tr>
+      <w:tr>
+        <w:tc>
+          <w:tcPr>
+            <w:tcW w:type="dxa" w:w="4680"/>
+            <w:tcBorders>
+              <w:top w:val="single" w:color="BFBFBF" w:sz="4"/>
+              <w:left w:val="single" w:color="BFBFBF" w:sz="4"/>
+              <w:bottom w:val="single" w:color="BFBFBF" w:sz="4"/>
+              <w:right w:val="single" w:color="BFBFBF" w:sz="4"/>
+            </w:tcBorders>
+            <w:tcMar>
+              <w:top w:type="dxa" w:w="80"/>
+              <w:left w:type="dxa" w:w="120"/>
+              <w:bottom w:type="dxa" w:w="80"/>
+              <w:right w:type="dxa" w:w="120"/>
+            </w:tcMar>
+          </w:tcPr>
+          <w:p>
+            <w:r>
+              <w:rPr>
+                <w:rFonts w:ascii="Malgun Gothic" w:cs="Malgun Gothic" w:eastAsia="Malgun Gothic" w:hAnsi="Malgun Gothic"/>
+                <w:sz w:val="20"/>
+                <w:szCs w:val="20"/>
+              </w:rPr>
+              <w:t xml:space="preserve">Net-30 상한</w:t>
+            </w:r>
+          </w:p>
+        </w:tc>
+        <w:tc>
+          <w:tcPr>
+            <w:tcW w:type="dxa" w:w="4680"/>
+            <w:tcBorders>
+              <w:top w:val="single" w:color="BFBFBF" w:sz="4"/>
+              <w:left w:val="single" w:color="BFBFBF" w:sz="4"/>
+              <w:bottom w:val="single" w:color="BFBFBF" w:sz="4"/>
+              <w:right w:val="single" w:color="BFBFBF" w:sz="4"/>
+            </w:tcBorders>
+            <w:tcMar>
+              <w:top w:type="dxa" w:w="80"/>
+              <w:left w:type="dxa" w:w="120"/>
+              <w:bottom w:type="dxa" w:w="80"/>
+              <w:right w:type="dxa" w:w="120"/>
+            </w:tcMar>
+          </w:tcPr>
+          <w:p>
+            <w:r>
+              <w:rPr>
+                <w:rFonts w:ascii="Malgun Gothic" w:cs="Malgun Gothic" w:eastAsia="Malgun Gothic" w:hAnsi="Malgun Gothic"/>
+                <w:sz w:val="20"/>
+                <w:szCs w:val="20"/>
+              </w:rPr>
+              <w:t xml:space="preserve">45일 (60일 절대 초과 금지)</w:t>
+            </w:r>
+          </w:p>
+        </w:tc>
+      </w:tr>
+      <w:tr>
+        <w:tc>
+          <w:tcPr>
+            <w:tcW w:type="dxa" w:w="4680"/>
+            <w:tcBorders>
+              <w:top w:val="single" w:color="BFBFBF" w:sz="4"/>
+              <w:left w:val="single" w:color="BFBFBF" w:sz="4"/>
+              <w:bottom w:val="single" w:color="BFBFBF" w:sz="4"/>
+              <w:right w:val="single" w:color="BFBFBF" w:sz="4"/>
+            </w:tcBorders>
+            <w:tcMar>
+              <w:top w:type="dxa" w:w="80"/>
+              <w:left w:type="dxa" w:w="120"/>
+              <w:bottom w:type="dxa" w:w="80"/>
+              <w:right w:type="dxa" w:w="120"/>
+            </w:tcMar>
+          </w:tcPr>
+          <w:p>
+            <w:r>
+              <w:rPr>
+                <w:rFonts w:ascii="Malgun Gothic" w:cs="Malgun Gothic" w:eastAsia="Malgun Gothic" w:hAnsi="Malgun Gothic"/>
+                <w:sz w:val="20"/>
+                <w:szCs w:val="20"/>
+              </w:rPr>
+              <w:t xml:space="preserve">환차손 회계</w:t>
+            </w:r>
+          </w:p>
+        </w:tc>
+        <w:tc>
+          <w:tcPr>
+            <w:tcW w:type="dxa" w:w="4680"/>
+            <w:tcBorders>
+              <w:top w:val="single" w:color="BFBFBF" w:sz="4"/>
+              <w:left w:val="single" w:color="BFBFBF" w:sz="4"/>
+              <w:bottom w:val="single" w:color="BFBFBF" w:sz="4"/>
+              <w:right w:val="single" w:color="BFBFBF" w:sz="4"/>
+            </w:tcBorders>
+            <w:tcMar>
+              <w:top w:type="dxa" w:w="80"/>
+              <w:left w:type="dxa" w:w="120"/>
+              <w:bottom w:type="dxa" w:w="80"/>
+              <w:right w:type="dxa" w:w="120"/>
+            </w:tcMar>
+          </w:tcPr>
+          <w:p>
+            <w:r>
+              <w:rPr>
+                <w:rFonts w:ascii="Malgun Gothic" w:cs="Malgun Gothic" w:eastAsia="Malgun Gothic" w:hAnsi="Malgun Gothic"/>
+                <w:sz w:val="20"/>
+                <w:szCs w:val="20"/>
+              </w:rPr>
+              <w:t xml:space="preserve">분기 정산 (CFO 운영)</w:t>
+            </w:r>
+          </w:p>
+        </w:tc>
+      </w:tr>
+      <w:tr>
+        <w:tc>
+          <w:tcPr>
+            <w:tcW w:type="dxa" w:w="4680"/>
+            <w:tcBorders>
+              <w:top w:val="single" w:color="BFBFBF" w:sz="4"/>
+              <w:left w:val="single" w:color="BFBFBF" w:sz="4"/>
+              <w:bottom w:val="single" w:color="BFBFBF" w:sz="4"/>
+              <w:right w:val="single" w:color="BFBFBF" w:sz="4"/>
+            </w:tcBorders>
+            <w:tcMar>
+              <w:top w:type="dxa" w:w="80"/>
+              <w:left w:type="dxa" w:w="120"/>
+              <w:bottom w:type="dxa" w:w="80"/>
+              <w:right w:type="dxa" w:w="120"/>
+            </w:tcMar>
+          </w:tcPr>
+          <w:p>
+            <w:r>
+              <w:rPr>
+                <w:rFonts w:ascii="Malgun Gothic" w:cs="Malgun Gothic" w:eastAsia="Malgun Gothic" w:hAnsi="Malgun Gothic"/>
+                <w:sz w:val="20"/>
+                <w:szCs w:val="20"/>
+              </w:rPr>
+              <w:t xml:space="preserve">90+일 Write-off</w:t>
+            </w:r>
+          </w:p>
+        </w:tc>
+        <w:tc>
+          <w:tcPr>
+            <w:tcW w:type="dxa" w:w="4680"/>
+            <w:tcBorders>
+              <w:top w:val="single" w:color="BFBFBF" w:sz="4"/>
+              <w:left w:val="single" w:color="BFBFBF" w:sz="4"/>
+              <w:bottom w:val="single" w:color="BFBFBF" w:sz="4"/>
+              <w:right w:val="single" w:color="BFBFBF" w:sz="4"/>
+            </w:tcBorders>
+            <w:tcMar>
+              <w:top w:type="dxa" w:w="80"/>
+              <w:left w:type="dxa" w:w="120"/>
+              <w:bottom w:type="dxa" w:w="80"/>
+              <w:right w:type="dxa" w:w="120"/>
+            </w:tcMar>
+          </w:tcPr>
+          <w:p>
+            <w:r>
+              <w:rPr>
+                <w:rFonts w:ascii="Malgun Gothic" w:cs="Malgun Gothic" w:eastAsia="Malgun Gothic" w:hAnsi="Malgun Gothic"/>
+                <w:sz w:val="20"/>
+                <w:szCs w:val="20"/>
+              </w:rPr>
+              <w:t xml:space="preserve">대표이사 결재</w:t>
+            </w:r>
+          </w:p>
+        </w:tc>
+      </w:tr>
+      <w:tr>
+        <w:tc>
+          <w:tcPr>
+            <w:tcW w:type="dxa" w:w="4680"/>
+            <w:tcBorders>
+              <w:top w:val="single" w:color="BFBFBF" w:sz="4"/>
+              <w:left w:val="single" w:color="BFBFBF" w:sz="4"/>
+              <w:bottom w:val="single" w:color="BFBFBF" w:sz="4"/>
+              <w:right w:val="single" w:color="BFBFBF" w:sz="4"/>
+            </w:tcBorders>
+            <w:tcMar>
+              <w:top w:type="dxa" w:w="80"/>
+              <w:left w:type="dxa" w:w="120"/>
+              <w:bottom w:type="dxa" w:w="80"/>
+              <w:right w:type="dxa" w:w="120"/>
+            </w:tcMar>
+          </w:tcPr>
+          <w:p>
+            <w:r>
+              <w:rPr>
+                <w:rFonts w:ascii="Malgun Gothic" w:cs="Malgun Gothic" w:eastAsia="Malgun Gothic" w:hAnsi="Malgun Gothic"/>
+                <w:sz w:val="20"/>
+                <w:szCs w:val="20"/>
+              </w:rPr>
+              <w:t xml:space="preserve">디포짓 종류</w:t>
+            </w:r>
+          </w:p>
+        </w:tc>
+        <w:tc>
+          <w:tcPr>
+            <w:tcW w:type="dxa" w:w="4680"/>
+            <w:tcBorders>
+              <w:top w:val="single" w:color="BFBFBF" w:sz="4"/>
+              <w:left w:val="single" w:color="BFBFBF" w:sz="4"/>
+              <w:bottom w:val="single" w:color="BFBFBF" w:sz="4"/>
+              <w:right w:val="single" w:color="BFBFBF" w:sz="4"/>
+            </w:tcBorders>
+            <w:tcMar>
+              <w:top w:type="dxa" w:w="80"/>
+              <w:left w:type="dxa" w:w="120"/>
+              <w:bottom w:type="dxa" w:w="80"/>
+              <w:right w:type="dxa" w:w="120"/>
+            </w:tcMar>
+          </w:tcPr>
+          <w:p>
+            <w:r>
+              <w:rPr>
+                <w:rFonts w:ascii="Malgun Gothic" w:cs="Malgun Gothic" w:eastAsia="Malgun Gothic" w:hAnsi="Malgun Gothic"/>
+                <w:sz w:val="20"/>
+                <w:szCs w:val="20"/>
+              </w:rPr>
+              <w:t xml:space="preserve">6종 유지</w:t>
+            </w:r>
+          </w:p>
+        </w:tc>
+      </w:tr>
+    </w:tbl>
+    <w:p>
+      <w:r>
+        <w:t xml:space="preserve"/>
       </w:r>
     </w:p>
     <w:p>
@@ -7190,35 +8275,12 @@
           <w:sz w:val="26"/>
           <w:szCs w:val="26"/>
         </w:rPr>
-        <w:t xml:space="preserve">📌 즉시 결재 가능 항목</w:t>
+        <w:t xml:space="preserve">📌 후속 작업</w:t>
       </w:r>
     </w:p>
     <w:p>
       <w:r>
         <w:t xml:space="preserve"/>
-      </w:r>
-    </w:p>
-    <w:p>
-      <w:pPr>
-        <w:spacing w:after="80"/>
-      </w:pPr>
-      <w:r>
-        <w:rPr>
-          <w:rFonts w:ascii="Malgun Gothic" w:cs="Malgun Gothic" w:eastAsia="Malgun Gothic" w:hAnsi="Malgun Gothic"/>
-          <w:b/>
-          <w:bCs/>
-          <w:sz w:val="20"/>
-          <w:szCs w:val="20"/>
-        </w:rPr>
-        <w:t xml:space="preserve">대표이사 결재 필요</w:t>
-      </w:r>
-      <w:r>
-        <w:rPr>
-          <w:rFonts w:ascii="Malgun Gothic" w:cs="Malgun Gothic" w:eastAsia="Malgun Gothic" w:hAnsi="Malgun Gothic"/>
-          <w:sz w:val="20"/>
-          <w:szCs w:val="20"/>
-        </w:rPr>
-        <w:t xml:space="preserve">:</w:t>
       </w:r>
     </w:p>
     <w:p>
@@ -7236,25 +8298,79 @@
           <w:sz w:val="20"/>
           <w:szCs w:val="20"/>
         </w:rPr>
-        <w:t xml:space="preserve">[ ] Section 4의 8가지 의사결정 항목 (옵션 선택)</w:t>
-      </w:r>
-    </w:p>
-    <w:p>
-      <w:r>
-        <w:t xml:space="preserve"/>
-      </w:r>
-    </w:p>
-    <w:p>
-      <w:pPr>
-        <w:spacing w:after="80"/>
-      </w:pPr>
-      <w:r>
-        <w:rPr>
-          <w:rFonts w:ascii="Malgun Gothic" w:cs="Malgun Gothic" w:eastAsia="Malgun Gothic" w:hAnsi="Malgun Gothic"/>
-          <w:sz w:val="20"/>
-          <w:szCs w:val="20"/>
-        </w:rPr>
-        <w:t xml:space="preserve">결재 후 → POLICY_CHANGELOG에 영구 기록 → 시스템 적용.</w:t>
+        <w:t xml:space="preserve">[ ] POLICY_CHANGELOG에 8개 결정 사항 영구 기록</w:t>
+      </w:r>
+    </w:p>
+    <w:p>
+      <w:pPr>
+        <w:pStyle w:val="ListParagraph"/>
+        <w:numPr>
+          <w:ilvl w:val="0"/>
+          <w:numId w:val="2"/>
+        </w:numPr>
+        <w:spacing w:after="60"/>
+      </w:pPr>
+      <w:r>
+        <w:rPr>
+          <w:rFonts w:ascii="Malgun Gothic" w:cs="Malgun Gothic" w:eastAsia="Malgun Gothic" w:hAnsi="Malgun Gothic"/>
+          <w:sz w:val="20"/>
+          <w:szCs w:val="20"/>
+        </w:rPr>
+        <w:t xml:space="preserve">[ ] PG 수수료 마진 반영 — 가격 책정 모델 업데이트 (CFO 협업)</w:t>
+      </w:r>
+    </w:p>
+    <w:p>
+      <w:pPr>
+        <w:pStyle w:val="ListParagraph"/>
+        <w:numPr>
+          <w:ilvl w:val="0"/>
+          <w:numId w:val="2"/>
+        </w:numPr>
+        <w:spacing w:after="60"/>
+      </w:pPr>
+      <w:r>
+        <w:rPr>
+          <w:rFonts w:ascii="Malgun Gothic" w:cs="Malgun Gothic" w:eastAsia="Malgun Gothic" w:hAnsi="Malgun Gothic"/>
+          <w:sz w:val="20"/>
+          <w:szCs w:val="20"/>
+        </w:rPr>
+        <w:t xml:space="preserve">[ ] No Deposit 결재 양식 ELLIS Admin에 추가</w:t>
+      </w:r>
+    </w:p>
+    <w:p>
+      <w:pPr>
+        <w:pStyle w:val="ListParagraph"/>
+        <w:numPr>
+          <w:ilvl w:val="0"/>
+          <w:numId w:val="2"/>
+        </w:numPr>
+        <w:spacing w:after="60"/>
+      </w:pPr>
+      <w:r>
+        <w:rPr>
+          <w:rFonts w:ascii="Malgun Gothic" w:cs="Malgun Gothic" w:eastAsia="Malgun Gothic" w:hAnsi="Malgun Gothic"/>
+          <w:sz w:val="20"/>
+          <w:szCs w:val="20"/>
+        </w:rPr>
+        <w:t xml:space="preserve">[ ] 분쟁 처리 SLA 문서화 (수동 검토 매뉴얼)</w:t>
+      </w:r>
+    </w:p>
+    <w:p>
+      <w:pPr>
+        <w:pStyle w:val="ListParagraph"/>
+        <w:numPr>
+          <w:ilvl w:val="0"/>
+          <w:numId w:val="2"/>
+        </w:numPr>
+        <w:spacing w:after="60"/>
+      </w:pPr>
+      <w:r>
+        <w:rPr>
+          <w:rFonts w:ascii="Malgun Gothic" w:cs="Malgun Gothic" w:eastAsia="Malgun Gothic" w:hAnsi="Malgun Gothic"/>
+          <w:sz w:val="20"/>
+          <w:szCs w:val="20"/>
+        </w:rPr>
+        <w:t xml:space="preserve">[ ] 소스마켓 진출 결재 양식에 통화 항목 추가</w:t>
       </w:r>
     </w:p>
     <w:p>

</xml_diff>